<commit_message>
feat: add prior-work evidence matrix and examiner TODO
</commit_message>
<xml_diff>
--- a/docs/manuscript/v0.2_2026-04-09/manuscript_draft_v0.2_2026-04-09_en.docx
+++ b/docs/manuscript/v0.2_2026-04-09/manuscript_draft_v0.2_2026-04-09_en.docx
@@ -2,7 +2,7 @@
 <file path=word/document.xml><?xml version="1.0" encoding="utf-8"?>
 <w:document xmlns:w="http://schemas.openxmlformats.org/wordprocessingml/2006/main" xmlns:m="http://schemas.openxmlformats.org/officeDocument/2006/math" xmlns:r="http://schemas.openxmlformats.org/officeDocument/2006/relationships" xmlns:o="urn:schemas-microsoft-com:office:office" xmlns:v="urn:schemas-microsoft-com:vml" xmlns:w10="urn:schemas-microsoft-com:office:word" xmlns:a="http://schemas.openxmlformats.org/drawingml/2006/main" xmlns:pic="http://schemas.openxmlformats.org/drawingml/2006/picture" xmlns:wp="http://schemas.openxmlformats.org/drawingml/2006/wordprocessingDrawing">
   <w:body>
-    <w:bookmarkStart w:id="39" w:name="X9cf75eb6c88c04ea3d3656b65c138eab314f5a4"/>
+    <w:bookmarkStart w:id="41" w:name="X9cf75eb6c88c04ea3d3656b65c138eab314f5a4"/>
     <w:p>
       <w:pPr>
         <w:pStyle w:val="Heading1"/>
@@ -3856,7 +3856,93 @@
       </w:r>
     </w:p>
     <w:bookmarkEnd w:id="38"/>
+    <w:bookmarkStart w:id="39" w:name="prior-work-evidence-matrix"/>
+    <w:p>
+      <w:pPr>
+        <w:pStyle w:val="Heading2"/>
+      </w:pPr>
+      <w:r>
+        <w:t xml:space="preserve">12. Prior-Work Evidence Matrix</w:t>
+      </w:r>
+    </w:p>
+    <w:p>
+      <w:pPr>
+        <w:numPr>
+          <w:ilvl w:val="0"/>
+          <w:numId w:val="1012"/>
+        </w:numPr>
+        <w:pStyle w:val="Compact"/>
+      </w:pPr>
+      <w:r>
+        <w:t xml:space="preserve">Evidence matrix:</w:t>
+      </w:r>
+      <w:r>
+        <w:t xml:space="preserve"> </w:t>
+      </w:r>
+      <w:r>
+        <w:rPr>
+          <w:rStyle w:val="VerbatimChar"/>
+        </w:rPr>
+        <w:t xml:space="preserve">prior_work_evidence_matrix_v0.2_2026-04-09.md</w:t>
+      </w:r>
+    </w:p>
+    <w:p>
+      <w:pPr>
+        <w:numPr>
+          <w:ilvl w:val="0"/>
+          <w:numId w:val="1012"/>
+        </w:numPr>
+        <w:pStyle w:val="Compact"/>
+      </w:pPr>
+      <w:r>
+        <w:t xml:space="preserve">It maps each core claim to supporting literature and explicitly documents residual gaps.</w:t>
+      </w:r>
+    </w:p>
     <w:bookmarkEnd w:id="39"/>
+    <w:bookmarkStart w:id="40" w:name="examiner-priority-todo"/>
+    <w:p>
+      <w:pPr>
+        <w:pStyle w:val="Heading2"/>
+      </w:pPr>
+      <w:r>
+        <w:t xml:space="preserve">13. Examiner-Priority TODO</w:t>
+      </w:r>
+    </w:p>
+    <w:p>
+      <w:pPr>
+        <w:numPr>
+          <w:ilvl w:val="0"/>
+          <w:numId w:val="1013"/>
+        </w:numPr>
+        <w:pStyle w:val="Compact"/>
+      </w:pPr>
+      <w:r>
+        <w:t xml:space="preserve">Detailed TODO:</w:t>
+      </w:r>
+      <w:r>
+        <w:t xml:space="preserve"> </w:t>
+      </w:r>
+      <w:r>
+        <w:rPr>
+          <w:rStyle w:val="VerbatimChar"/>
+        </w:rPr>
+        <w:t xml:space="preserve">examiner_critical_todo_v0.2_2026-04-09.md</w:t>
+      </w:r>
+    </w:p>
+    <w:p>
+      <w:pPr>
+        <w:numPr>
+          <w:ilvl w:val="0"/>
+          <w:numId w:val="1013"/>
+        </w:numPr>
+        <w:pStyle w:val="Compact"/>
+      </w:pPr>
+      <w:r>
+        <w:t xml:space="preserve">This TODO prioritizes novelty framing, statistical testing, external validation scope, and operational threshold interpretation.</w:t>
+      </w:r>
+    </w:p>
+    <w:bookmarkEnd w:id="40"/>
+    <w:bookmarkEnd w:id="41"/>
     <w:sectPr/>
   </w:body>
 </w:document>
@@ -4073,6 +4159,12 @@
     <w:abstractNumId w:val="991"/>
   </w:num>
   <w:num w:numId="1011">
+    <w:abstractNumId w:val="991"/>
+  </w:num>
+  <w:num w:numId="1012">
+    <w:abstractNumId w:val="991"/>
+  </w:num>
+  <w:num w:numId="1013">
     <w:abstractNumId w:val="991"/>
   </w:num>
 </w:numbering>

</xml_diff>

<commit_message>
feat: add statistical significance appendix for model-family comparison
</commit_message>
<xml_diff>
--- a/docs/manuscript/v0.2_2026-04-09/manuscript_draft_v0.2_2026-04-09_en.docx
+++ b/docs/manuscript/v0.2_2026-04-09/manuscript_draft_v0.2_2026-04-09_en.docx
@@ -2,7 +2,7 @@
 <file path=word/document.xml><?xml version="1.0" encoding="utf-8"?>
 <w:document xmlns:w="http://schemas.openxmlformats.org/wordprocessingml/2006/main" xmlns:m="http://schemas.openxmlformats.org/officeDocument/2006/math" xmlns:r="http://schemas.openxmlformats.org/officeDocument/2006/relationships" xmlns:o="urn:schemas-microsoft-com:office:office" xmlns:v="urn:schemas-microsoft-com:vml" xmlns:w10="urn:schemas-microsoft-com:office:word" xmlns:a="http://schemas.openxmlformats.org/drawingml/2006/main" xmlns:pic="http://schemas.openxmlformats.org/drawingml/2006/picture" xmlns:wp="http://schemas.openxmlformats.org/drawingml/2006/wordprocessingDrawing">
   <w:body>
-    <w:bookmarkStart w:id="41" w:name="X9cf75eb6c88c04ea3d3656b65c138eab314f5a4"/>
+    <w:bookmarkStart w:id="42" w:name="X9cf75eb6c88c04ea3d3656b65c138eab314f5a4"/>
     <w:p>
       <w:pPr>
         <w:pStyle w:val="Heading1"/>
@@ -3942,7 +3942,519 @@
       </w:r>
     </w:p>
     <w:bookmarkEnd w:id="40"/>
+    <w:bookmarkStart w:id="41" w:name="statistical-significance-appendix"/>
+    <w:p>
+      <w:pPr>
+        <w:pStyle w:val="Heading2"/>
+      </w:pPr>
+      <w:r>
+        <w:t xml:space="preserve">14. Statistical Significance Appendix</w:t>
+      </w:r>
+    </w:p>
+    <w:p>
+      <w:pPr>
+        <w:numPr>
+          <w:ilvl w:val="0"/>
+          <w:numId w:val="1014"/>
+        </w:numPr>
+        <w:pStyle w:val="Compact"/>
+      </w:pPr>
+      <w:r>
+        <w:t xml:space="preserve">Significance summary CSV:</w:t>
+      </w:r>
+      <w:r>
+        <w:t xml:space="preserve"> </w:t>
+      </w:r>
+      <w:r>
+        <w:rPr>
+          <w:rStyle w:val="VerbatimChar"/>
+        </w:rPr>
+        <w:t xml:space="preserve">model_family_significance_summary.csv</w:t>
+      </w:r>
+    </w:p>
+    <w:p>
+      <w:pPr>
+        <w:numPr>
+          <w:ilvl w:val="0"/>
+          <w:numId w:val="1014"/>
+        </w:numPr>
+        <w:pStyle w:val="Compact"/>
+      </w:pPr>
+      <w:r>
+        <w:t xml:space="preserve">Appendix document:</w:t>
+      </w:r>
+      <w:r>
+        <w:t xml:space="preserve"> </w:t>
+      </w:r>
+      <w:r>
+        <w:rPr>
+          <w:rStyle w:val="VerbatimChar"/>
+        </w:rPr>
+        <w:t xml:space="preserve">statistical_significance_appendix_v0.2_2026-04-09.md</w:t>
+      </w:r>
+    </w:p>
+    <w:p>
+      <w:pPr>
+        <w:numPr>
+          <w:ilvl w:val="0"/>
+          <w:numId w:val="1014"/>
+        </w:numPr>
+        <w:pStyle w:val="Compact"/>
+      </w:pPr>
+      <w:r>
+        <w:t xml:space="preserve">Test configuration: Paired exact sign test + paired exact permutation test with Holm correction (p&lt;0.05).</w:t>
+      </w:r>
+    </w:p>
+    <w:tbl>
+      <w:tblPr>
+        <w:tblStyle w:val="Table"/>
+        <w:tblW w:type="pct" w:w="4999.999999999998"/>
+        <w:tblLook w:firstRow="1" w:lastRow="0" w:firstColumn="0" w:lastColumn="0" w:noHBand="0" w:noVBand="0" w:val="0020"/>
+      </w:tblPr>
+      <w:tblGrid>
+        <w:gridCol w:w="879"/>
+        <w:gridCol w:w="879"/>
+        <w:gridCol w:w="879"/>
+        <w:gridCol w:w="879"/>
+        <w:gridCol w:w="879"/>
+        <w:gridCol w:w="879"/>
+        <w:gridCol w:w="879"/>
+        <w:gridCol w:w="879"/>
+        <w:gridCol w:w="879"/>
+      </w:tblGrid>
+      <w:tr>
+        <w:tc>
+          <w:p>
+            <w:pPr>
+              <w:pStyle w:val="Compact"/>
+              <w:jc w:val="left"/>
+            </w:pPr>
+            <w:r>
+              <w:t xml:space="preserve">region</w:t>
+            </w:r>
+          </w:p>
+        </w:tc>
+        <w:tc>
+          <w:p>
+            <w:pPr>
+              <w:pStyle w:val="Compact"/>
+              <w:jc w:val="left"/>
+            </w:pPr>
+            <w:r>
+              <w:t xml:space="preserve">tabular_model</w:t>
+            </w:r>
+          </w:p>
+        </w:tc>
+        <w:tc>
+          <w:p>
+            <w:pPr>
+              <w:pStyle w:val="Compact"/>
+              <w:jc w:val="left"/>
+            </w:pPr>
+            <w:r>
+              <w:t xml:space="preserve">raster_cnn_model</w:t>
+            </w:r>
+          </w:p>
+        </w:tc>
+        <w:tc>
+          <w:p>
+            <w:pPr>
+              <w:pStyle w:val="Compact"/>
+              <w:jc w:val="left"/>
+            </w:pPr>
+            <w:r>
+              <w:t xml:space="preserve">n_pairs</w:t>
+            </w:r>
+          </w:p>
+        </w:tc>
+        <w:tc>
+          <w:p>
+            <w:pPr>
+              <w:pStyle w:val="Compact"/>
+              <w:jc w:val="left"/>
+            </w:pPr>
+            <w:r>
+              <w:t xml:space="preserve">f1_delta_mean_tabular_minus_cnn</w:t>
+            </w:r>
+          </w:p>
+        </w:tc>
+        <w:tc>
+          <w:p>
+            <w:pPr>
+              <w:pStyle w:val="Compact"/>
+              <w:jc w:val="left"/>
+            </w:pPr>
+            <w:r>
+              <w:t xml:space="preserve">f1_permutation_p_holm</w:t>
+            </w:r>
+          </w:p>
+        </w:tc>
+        <w:tc>
+          <w:p>
+            <w:pPr>
+              <w:pStyle w:val="Compact"/>
+              <w:jc w:val="left"/>
+            </w:pPr>
+            <w:r>
+              <w:t xml:space="preserve">ece_delta_mean_tabular_minus_cnn</w:t>
+            </w:r>
+          </w:p>
+        </w:tc>
+        <w:tc>
+          <w:p>
+            <w:pPr>
+              <w:pStyle w:val="Compact"/>
+              <w:jc w:val="left"/>
+            </w:pPr>
+            <w:r>
+              <w:t xml:space="preserve">ece_permutation_p_holm</w:t>
+            </w:r>
+          </w:p>
+        </w:tc>
+        <w:tc>
+          <w:p>
+            <w:pPr>
+              <w:pStyle w:val="Compact"/>
+              <w:jc w:val="left"/>
+            </w:pPr>
+            <w:r>
+              <w:t xml:space="preserve">interpretation</w:t>
+            </w:r>
+          </w:p>
+        </w:tc>
+      </w:tr>
+      <w:tr>
+        <w:tc>
+          <w:p>
+            <w:pPr>
+              <w:pStyle w:val="Compact"/>
+              <w:jc w:val="left"/>
+            </w:pPr>
+            <w:r>
+              <w:t xml:space="preserve">houston</w:t>
+            </w:r>
+          </w:p>
+        </w:tc>
+        <w:tc>
+          <w:p>
+            <w:pPr>
+              <w:pStyle w:val="Compact"/>
+              <w:jc w:val="left"/>
+            </w:pPr>
+            <w:r>
+              <w:t xml:space="preserve">hgbt</w:t>
+            </w:r>
+          </w:p>
+        </w:tc>
+        <w:tc>
+          <w:p>
+            <w:pPr>
+              <w:pStyle w:val="Compact"/>
+              <w:jc w:val="left"/>
+            </w:pPr>
+            <w:r>
+              <w:t xml:space="preserve">cnn_weighted</w:t>
+            </w:r>
+          </w:p>
+        </w:tc>
+        <w:tc>
+          <w:p>
+            <w:pPr>
+              <w:pStyle w:val="Compact"/>
+              <w:jc w:val="left"/>
+            </w:pPr>
+            <w:r>
+              <w:t xml:space="preserve">10</w:t>
+            </w:r>
+          </w:p>
+        </w:tc>
+        <w:tc>
+          <w:p>
+            <w:pPr>
+              <w:pStyle w:val="Compact"/>
+              <w:jc w:val="left"/>
+            </w:pPr>
+            <w:r>
+              <w:t xml:space="preserve">+0.0089</w:t>
+            </w:r>
+          </w:p>
+        </w:tc>
+        <w:tc>
+          <w:p>
+            <w:pPr>
+              <w:pStyle w:val="Compact"/>
+              <w:jc w:val="left"/>
+            </w:pPr>
+            <w:r>
+              <w:t xml:space="preserve">0.3359</w:t>
+            </w:r>
+          </w:p>
+        </w:tc>
+        <w:tc>
+          <w:p>
+            <w:pPr>
+              <w:pStyle w:val="Compact"/>
+              <w:jc w:val="left"/>
+            </w:pPr>
+            <w:r>
+              <w:t xml:space="preserve">-0.1446</w:t>
+            </w:r>
+          </w:p>
+        </w:tc>
+        <w:tc>
+          <w:p>
+            <w:pPr>
+              <w:pStyle w:val="Compact"/>
+              <w:jc w:val="left"/>
+            </w:pPr>
+            <w:r>
+              <w:t xml:space="preserve">0.0060</w:t>
+            </w:r>
+          </w:p>
+        </w:tc>
+        <w:tc>
+          <w:p>
+            <w:pPr>
+              <w:pStyle w:val="Compact"/>
+              <w:jc w:val="left"/>
+            </w:pPr>
+            <w:r>
+              <w:t xml:space="preserve">no significant F1 difference; tabular significantly lower ECE</w:t>
+            </w:r>
+          </w:p>
+        </w:tc>
+      </w:tr>
+      <w:tr>
+        <w:tc>
+          <w:p>
+            <w:pPr>
+              <w:pStyle w:val="Compact"/>
+              <w:jc w:val="left"/>
+            </w:pPr>
+            <w:r>
+              <w:t xml:space="preserve">nola</w:t>
+            </w:r>
+          </w:p>
+        </w:tc>
+        <w:tc>
+          <w:p>
+            <w:pPr>
+              <w:pStyle w:val="Compact"/>
+              <w:jc w:val="left"/>
+            </w:pPr>
+            <w:r>
+              <w:t xml:space="preserve">hgbt</w:t>
+            </w:r>
+          </w:p>
+        </w:tc>
+        <w:tc>
+          <w:p>
+            <w:pPr>
+              <w:pStyle w:val="Compact"/>
+              <w:jc w:val="left"/>
+            </w:pPr>
+            <w:r>
+              <w:t xml:space="preserve">cnn_weighted</w:t>
+            </w:r>
+          </w:p>
+        </w:tc>
+        <w:tc>
+          <w:p>
+            <w:pPr>
+              <w:pStyle w:val="Compact"/>
+              <w:jc w:val="left"/>
+            </w:pPr>
+            <w:r>
+              <w:t xml:space="preserve">10</w:t>
+            </w:r>
+          </w:p>
+        </w:tc>
+        <w:tc>
+          <w:p>
+            <w:pPr>
+              <w:pStyle w:val="Compact"/>
+              <w:jc w:val="left"/>
+            </w:pPr>
+            <w:r>
+              <w:t xml:space="preserve">+0.1559</w:t>
+            </w:r>
+          </w:p>
+        </w:tc>
+        <w:tc>
+          <w:p>
+            <w:pPr>
+              <w:pStyle w:val="Compact"/>
+              <w:jc w:val="left"/>
+            </w:pPr>
+            <w:r>
+              <w:t xml:space="preserve">0.0117</w:t>
+            </w:r>
+          </w:p>
+        </w:tc>
+        <w:tc>
+          <w:p>
+            <w:pPr>
+              <w:pStyle w:val="Compact"/>
+              <w:jc w:val="left"/>
+            </w:pPr>
+            <w:r>
+              <w:t xml:space="preserve">-0.0870</w:t>
+            </w:r>
+          </w:p>
+        </w:tc>
+        <w:tc>
+          <w:p>
+            <w:pPr>
+              <w:pStyle w:val="Compact"/>
+              <w:jc w:val="left"/>
+            </w:pPr>
+            <w:r>
+              <w:t xml:space="preserve">0.0060</w:t>
+            </w:r>
+          </w:p>
+        </w:tc>
+        <w:tc>
+          <w:p>
+            <w:pPr>
+              <w:pStyle w:val="Compact"/>
+              <w:jc w:val="left"/>
+            </w:pPr>
+            <w:r>
+              <w:t xml:space="preserve">tabular significantly higher F1; tabular significantly lower ECE</w:t>
+            </w:r>
+          </w:p>
+        </w:tc>
+      </w:tr>
+      <w:tr>
+        <w:tc>
+          <w:p>
+            <w:pPr>
+              <w:pStyle w:val="Compact"/>
+              <w:jc w:val="left"/>
+            </w:pPr>
+            <w:r>
+              <w:t xml:space="preserve">seattle</w:t>
+            </w:r>
+          </w:p>
+        </w:tc>
+        <w:tc>
+          <w:p>
+            <w:pPr>
+              <w:pStyle w:val="Compact"/>
+              <w:jc w:val="left"/>
+            </w:pPr>
+            <w:r>
+              <w:t xml:space="preserve">logreg</w:t>
+            </w:r>
+          </w:p>
+        </w:tc>
+        <w:tc>
+          <w:p>
+            <w:pPr>
+              <w:pStyle w:val="Compact"/>
+              <w:jc w:val="left"/>
+            </w:pPr>
+            <w:r>
+              <w:t xml:space="preserve">cnn_weighted</w:t>
+            </w:r>
+          </w:p>
+        </w:tc>
+        <w:tc>
+          <w:p>
+            <w:pPr>
+              <w:pStyle w:val="Compact"/>
+              <w:jc w:val="left"/>
+            </w:pPr>
+            <w:r>
+              <w:t xml:space="preserve">10</w:t>
+            </w:r>
+          </w:p>
+        </w:tc>
+        <w:tc>
+          <w:p>
+            <w:pPr>
+              <w:pStyle w:val="Compact"/>
+              <w:jc w:val="left"/>
+            </w:pPr>
+            <w:r>
+              <w:t xml:space="preserve">+0.0136</w:t>
+            </w:r>
+          </w:p>
+        </w:tc>
+        <w:tc>
+          <w:p>
+            <w:pPr>
+              <w:pStyle w:val="Compact"/>
+              <w:jc w:val="left"/>
+            </w:pPr>
+            <w:r>
+              <w:t xml:space="preserve">0.0117</w:t>
+            </w:r>
+          </w:p>
+        </w:tc>
+        <w:tc>
+          <w:p>
+            <w:pPr>
+              <w:pStyle w:val="Compact"/>
+              <w:jc w:val="left"/>
+            </w:pPr>
+            <w:r>
+              <w:t xml:space="preserve">-0.2572</w:t>
+            </w:r>
+          </w:p>
+        </w:tc>
+        <w:tc>
+          <w:p>
+            <w:pPr>
+              <w:pStyle w:val="Compact"/>
+              <w:jc w:val="left"/>
+            </w:pPr>
+            <w:r>
+              <w:t xml:space="preserve">0.0060</w:t>
+            </w:r>
+          </w:p>
+        </w:tc>
+        <w:tc>
+          <w:p>
+            <w:pPr>
+              <w:pStyle w:val="Compact"/>
+              <w:jc w:val="left"/>
+            </w:pPr>
+            <w:r>
+              <w:t xml:space="preserve">tabular significantly higher F1; tabular significantly lower ECE</w:t>
+            </w:r>
+          </w:p>
+        </w:tc>
+      </w:tr>
+    </w:tbl>
+    <w:p>
+      <w:pPr>
+        <w:pStyle w:val="BodyText"/>
+      </w:pPr>
+      <w:r>
+        <w:t xml:space="preserve">Key interpretation:</w:t>
+      </w:r>
+      <w:r>
+        <w:t xml:space="preserve"> </w:t>
+      </w:r>
+      <w:r>
+        <w:t xml:space="preserve">- houston: ΔF1=+0.0089 (Holm p=0.3359), ΔECE=-0.1446 (Holm p=0.0060)</w:t>
+      </w:r>
+      <w:r>
+        <w:t xml:space="preserve"> </w:t>
+      </w:r>
+      <w:r>
+        <w:t xml:space="preserve">- nola: ΔF1=+0.1559 (Holm p=0.0117), ΔECE=-0.0870 (Holm p=0.0060)</w:t>
+      </w:r>
+      <w:r>
+        <w:t xml:space="preserve"> </w:t>
+      </w:r>
+      <w:r>
+        <w:t xml:space="preserve">- seattle: ΔF1=+0.0136 (Holm p=0.0117), ΔECE=-0.2572 (Holm p=0.0060)</w:t>
+      </w:r>
+    </w:p>
     <w:bookmarkEnd w:id="41"/>
+    <w:bookmarkEnd w:id="42"/>
     <w:sectPr/>
   </w:body>
 </w:document>
@@ -4165,6 +4677,9 @@
     <w:abstractNumId w:val="991"/>
   </w:num>
   <w:num w:numId="1013">
+    <w:abstractNumId w:val="991"/>
+  </w:num>
+  <w:num w:numId="1014">
     <w:abstractNumId w:val="991"/>
   </w:num>
 </w:numbering>

</xml_diff>

<commit_message>
feat: add transfer-route bootstrap significance appendix
</commit_message>
<xml_diff>
--- a/docs/manuscript/v0.2_2026-04-09/manuscript_draft_v0.2_2026-04-09_en.docx
+++ b/docs/manuscript/v0.2_2026-04-09/manuscript_draft_v0.2_2026-04-09_en.docx
@@ -2,7 +2,7 @@
 <file path=word/document.xml><?xml version="1.0" encoding="utf-8"?>
 <w:document xmlns:w="http://schemas.openxmlformats.org/wordprocessingml/2006/main" xmlns:m="http://schemas.openxmlformats.org/officeDocument/2006/math" xmlns:r="http://schemas.openxmlformats.org/officeDocument/2006/relationships" xmlns:o="urn:schemas-microsoft-com:office:office" xmlns:v="urn:schemas-microsoft-com:vml" xmlns:w10="urn:schemas-microsoft-com:office:word" xmlns:a="http://schemas.openxmlformats.org/drawingml/2006/main" xmlns:pic="http://schemas.openxmlformats.org/drawingml/2006/picture" xmlns:wp="http://schemas.openxmlformats.org/drawingml/2006/wordprocessingDrawing">
   <w:body>
-    <w:bookmarkStart w:id="42" w:name="X9cf75eb6c88c04ea3d3656b65c138eab314f5a4"/>
+    <w:bookmarkStart w:id="43" w:name="X9cf75eb6c88c04ea3d3656b65c138eab314f5a4"/>
     <w:p>
       <w:pPr>
         <w:pStyle w:val="Heading1"/>
@@ -4454,7 +4454,750 @@
       </w:r>
     </w:p>
     <w:bookmarkEnd w:id="41"/>
+    <w:bookmarkStart w:id="42" w:name="X0d7739412717a22a0ae688af860fff346e5f7e0"/>
+    <w:p>
+      <w:pPr>
+        <w:pStyle w:val="Heading2"/>
+      </w:pPr>
+      <w:r>
+        <w:t xml:space="preserve">15. Transfer-Route Significance Appendix (bootstrap)</w:t>
+      </w:r>
+    </w:p>
+    <w:p>
+      <w:pPr>
+        <w:numPr>
+          <w:ilvl w:val="0"/>
+          <w:numId w:val="1015"/>
+        </w:numPr>
+        <w:pStyle w:val="Compact"/>
+      </w:pPr>
+      <w:r>
+        <w:t xml:space="preserve">Transfer-route significance CSV:</w:t>
+      </w:r>
+      <w:r>
+        <w:t xml:space="preserve"> </w:t>
+      </w:r>
+      <w:r>
+        <w:rPr>
+          <w:rStyle w:val="VerbatimChar"/>
+        </w:rPr>
+        <w:t xml:space="preserve">transfer_route_significance_summary.csv</w:t>
+      </w:r>
+    </w:p>
+    <w:p>
+      <w:pPr>
+        <w:numPr>
+          <w:ilvl w:val="0"/>
+          <w:numId w:val="1015"/>
+        </w:numPr>
+        <w:pStyle w:val="Compact"/>
+      </w:pPr>
+      <w:r>
+        <w:t xml:space="preserve">Appendix document:</w:t>
+      </w:r>
+      <w:r>
+        <w:t xml:space="preserve"> </w:t>
+      </w:r>
+      <w:r>
+        <w:rPr>
+          <w:rStyle w:val="VerbatimChar"/>
+        </w:rPr>
+        <w:t xml:space="preserve">transfer_route_significance_appendix_v0.2_2026-04-09.md</w:t>
+      </w:r>
+    </w:p>
+    <w:tbl>
+      <w:tblPr>
+        <w:tblStyle w:val="Table"/>
+        <w:tblW w:type="pct" w:w="5000.0"/>
+        <w:tblLook w:firstRow="1" w:lastRow="0" w:firstColumn="0" w:lastColumn="0" w:noHBand="0" w:noVBand="0" w:val="0020"/>
+      </w:tblPr>
+      <w:tblGrid>
+        <w:gridCol w:w="990"/>
+        <w:gridCol w:w="990"/>
+        <w:gridCol w:w="990"/>
+        <w:gridCol w:w="990"/>
+        <w:gridCol w:w="990"/>
+        <w:gridCol w:w="990"/>
+        <w:gridCol w:w="990"/>
+        <w:gridCol w:w="990"/>
+      </w:tblGrid>
+      <w:tr>
+        <w:tc>
+          <w:p>
+            <w:pPr>
+              <w:pStyle w:val="Compact"/>
+              <w:jc w:val="left"/>
+            </w:pPr>
+            <w:r>
+              <w:t xml:space="preserve">source_region</w:t>
+            </w:r>
+          </w:p>
+        </w:tc>
+        <w:tc>
+          <w:p>
+            <w:pPr>
+              <w:pStyle w:val="Compact"/>
+              <w:jc w:val="left"/>
+            </w:pPr>
+            <w:r>
+              <w:t xml:space="preserve">target_region</w:t>
+            </w:r>
+          </w:p>
+        </w:tc>
+        <w:tc>
+          <w:p>
+            <w:pPr>
+              <w:pStyle w:val="Compact"/>
+              <w:jc w:val="left"/>
+            </w:pPr>
+            <w:r>
+              <w:t xml:space="preserve">recommended_model</w:t>
+            </w:r>
+          </w:p>
+        </w:tc>
+        <w:tc>
+          <w:p>
+            <w:pPr>
+              <w:pStyle w:val="Compact"/>
+              <w:jc w:val="left"/>
+            </w:pPr>
+            <w:r>
+              <w:t xml:space="preserve">observed_delta_f1</w:t>
+            </w:r>
+          </w:p>
+        </w:tc>
+        <w:tc>
+          <w:p>
+            <w:pPr>
+              <w:pStyle w:val="Compact"/>
+              <w:jc w:val="left"/>
+            </w:pPr>
+            <w:r>
+              <w:t xml:space="preserve">bootstrap_delta_ci95</w:t>
+            </w:r>
+          </w:p>
+        </w:tc>
+        <w:tc>
+          <w:p>
+            <w:pPr>
+              <w:pStyle w:val="Compact"/>
+              <w:jc w:val="left"/>
+            </w:pPr>
+            <w:r>
+              <w:t xml:space="preserve">bootstrap_p_two_sided</w:t>
+            </w:r>
+          </w:p>
+        </w:tc>
+        <w:tc>
+          <w:p>
+            <w:pPr>
+              <w:pStyle w:val="Compact"/>
+              <w:jc w:val="left"/>
+            </w:pPr>
+            <w:r>
+              <w:t xml:space="preserve">direction_probability</w:t>
+            </w:r>
+          </w:p>
+        </w:tc>
+        <w:tc>
+          <w:p>
+            <w:pPr>
+              <w:pStyle w:val="Compact"/>
+              <w:jc w:val="left"/>
+            </w:pPr>
+            <w:r>
+              <w:t xml:space="preserve">interpretation</w:t>
+            </w:r>
+          </w:p>
+        </w:tc>
+      </w:tr>
+      <w:tr>
+        <w:tc>
+          <w:p>
+            <w:pPr>
+              <w:pStyle w:val="Compact"/>
+              <w:jc w:val="left"/>
+            </w:pPr>
+            <w:r>
+              <w:t xml:space="preserve">houston</w:t>
+            </w:r>
+          </w:p>
+        </w:tc>
+        <w:tc>
+          <w:p>
+            <w:pPr>
+              <w:pStyle w:val="Compact"/>
+              <w:jc w:val="left"/>
+            </w:pPr>
+            <w:r>
+              <w:t xml:space="preserve">nola</w:t>
+            </w:r>
+          </w:p>
+        </w:tc>
+        <w:tc>
+          <w:p>
+            <w:pPr>
+              <w:pStyle w:val="Compact"/>
+              <w:jc w:val="left"/>
+            </w:pPr>
+            <w:r>
+              <w:t xml:space="preserve">hgbt</w:t>
+            </w:r>
+          </w:p>
+        </w:tc>
+        <w:tc>
+          <w:p>
+            <w:pPr>
+              <w:pStyle w:val="Compact"/>
+              <w:jc w:val="left"/>
+            </w:pPr>
+            <w:r>
+              <w:t xml:space="preserve">-0.1383</w:t>
+            </w:r>
+          </w:p>
+        </w:tc>
+        <w:tc>
+          <w:p>
+            <w:pPr>
+              <w:pStyle w:val="Compact"/>
+              <w:jc w:val="left"/>
+            </w:pPr>
+            <w:r>
+              <w:t xml:space="preserve">[-0.1634, -0.1152]</w:t>
+            </w:r>
+          </w:p>
+        </w:tc>
+        <w:tc>
+          <w:p>
+            <w:pPr>
+              <w:pStyle w:val="Compact"/>
+              <w:jc w:val="left"/>
+            </w:pPr>
+            <w:r>
+              <w:t xml:space="preserve">0.0000</w:t>
+            </w:r>
+          </w:p>
+        </w:tc>
+        <w:tc>
+          <w:p>
+            <w:pPr>
+              <w:pStyle w:val="Compact"/>
+              <w:jc w:val="left"/>
+            </w:pPr>
+            <w:r>
+              <w:t xml:space="preserve">1.0000</w:t>
+            </w:r>
+          </w:p>
+        </w:tc>
+        <w:tc>
+          <w:p>
+            <w:pPr>
+              <w:pStyle w:val="Compact"/>
+              <w:jc w:val="left"/>
+            </w:pPr>
+            <w:r>
+              <w:t xml:space="preserve">statistically_supported_negative_transfer</w:t>
+            </w:r>
+          </w:p>
+        </w:tc>
+      </w:tr>
+      <w:tr>
+        <w:tc>
+          <w:p>
+            <w:pPr>
+              <w:pStyle w:val="Compact"/>
+              <w:jc w:val="left"/>
+            </w:pPr>
+            <w:r>
+              <w:t xml:space="preserve">houston</w:t>
+            </w:r>
+          </w:p>
+        </w:tc>
+        <w:tc>
+          <w:p>
+            <w:pPr>
+              <w:pStyle w:val="Compact"/>
+              <w:jc w:val="left"/>
+            </w:pPr>
+            <w:r>
+              <w:t xml:space="preserve">seattle</w:t>
+            </w:r>
+          </w:p>
+        </w:tc>
+        <w:tc>
+          <w:p>
+            <w:pPr>
+              <w:pStyle w:val="Compact"/>
+              <w:jc w:val="left"/>
+            </w:pPr>
+            <w:r>
+              <w:t xml:space="preserve">hgbt</w:t>
+            </w:r>
+          </w:p>
+        </w:tc>
+        <w:tc>
+          <w:p>
+            <w:pPr>
+              <w:pStyle w:val="Compact"/>
+              <w:jc w:val="left"/>
+            </w:pPr>
+            <w:r>
+              <w:t xml:space="preserve">-0.2103</w:t>
+            </w:r>
+          </w:p>
+        </w:tc>
+        <w:tc>
+          <w:p>
+            <w:pPr>
+              <w:pStyle w:val="Compact"/>
+              <w:jc w:val="left"/>
+            </w:pPr>
+            <w:r>
+              <w:t xml:space="preserve">[-0.2413, -0.1767]</w:t>
+            </w:r>
+          </w:p>
+        </w:tc>
+        <w:tc>
+          <w:p>
+            <w:pPr>
+              <w:pStyle w:val="Compact"/>
+              <w:jc w:val="left"/>
+            </w:pPr>
+            <w:r>
+              <w:t xml:space="preserve">0.0000</w:t>
+            </w:r>
+          </w:p>
+        </w:tc>
+        <w:tc>
+          <w:p>
+            <w:pPr>
+              <w:pStyle w:val="Compact"/>
+              <w:jc w:val="left"/>
+            </w:pPr>
+            <w:r>
+              <w:t xml:space="preserve">1.0000</w:t>
+            </w:r>
+          </w:p>
+        </w:tc>
+        <w:tc>
+          <w:p>
+            <w:pPr>
+              <w:pStyle w:val="Compact"/>
+              <w:jc w:val="left"/>
+            </w:pPr>
+            <w:r>
+              <w:t xml:space="preserve">statistically_supported_negative_transfer</w:t>
+            </w:r>
+          </w:p>
+        </w:tc>
+      </w:tr>
+      <w:tr>
+        <w:tc>
+          <w:p>
+            <w:pPr>
+              <w:pStyle w:val="Compact"/>
+              <w:jc w:val="left"/>
+            </w:pPr>
+            <w:r>
+              <w:t xml:space="preserve">nola</w:t>
+            </w:r>
+          </w:p>
+        </w:tc>
+        <w:tc>
+          <w:p>
+            <w:pPr>
+              <w:pStyle w:val="Compact"/>
+              <w:jc w:val="left"/>
+            </w:pPr>
+            <w:r>
+              <w:t xml:space="preserve">houston</w:t>
+            </w:r>
+          </w:p>
+        </w:tc>
+        <w:tc>
+          <w:p>
+            <w:pPr>
+              <w:pStyle w:val="Compact"/>
+              <w:jc w:val="left"/>
+            </w:pPr>
+            <w:r>
+              <w:t xml:space="preserve">hgbt</w:t>
+            </w:r>
+          </w:p>
+        </w:tc>
+        <w:tc>
+          <w:p>
+            <w:pPr>
+              <w:pStyle w:val="Compact"/>
+              <w:jc w:val="left"/>
+            </w:pPr>
+            <w:r>
+              <w:t xml:space="preserve">+0.3213</w:t>
+            </w:r>
+          </w:p>
+        </w:tc>
+        <w:tc>
+          <w:p>
+            <w:pPr>
+              <w:pStyle w:val="Compact"/>
+              <w:jc w:val="left"/>
+            </w:pPr>
+            <w:r>
+              <w:t xml:space="preserve">[+0.2332, +0.3986]</w:t>
+            </w:r>
+          </w:p>
+        </w:tc>
+        <w:tc>
+          <w:p>
+            <w:pPr>
+              <w:pStyle w:val="Compact"/>
+              <w:jc w:val="left"/>
+            </w:pPr>
+            <w:r>
+              <w:t xml:space="preserve">0.0000</w:t>
+            </w:r>
+          </w:p>
+        </w:tc>
+        <w:tc>
+          <w:p>
+            <w:pPr>
+              <w:pStyle w:val="Compact"/>
+              <w:jc w:val="left"/>
+            </w:pPr>
+            <w:r>
+              <w:t xml:space="preserve">1.0000</w:t>
+            </w:r>
+          </w:p>
+        </w:tc>
+        <w:tc>
+          <w:p>
+            <w:pPr>
+              <w:pStyle w:val="Compact"/>
+              <w:jc w:val="left"/>
+            </w:pPr>
+            <w:r>
+              <w:t xml:space="preserve">statistically_supported_positive_transfer</w:t>
+            </w:r>
+          </w:p>
+        </w:tc>
+      </w:tr>
+      <w:tr>
+        <w:tc>
+          <w:p>
+            <w:pPr>
+              <w:pStyle w:val="Compact"/>
+              <w:jc w:val="left"/>
+            </w:pPr>
+            <w:r>
+              <w:t xml:space="preserve">nola</w:t>
+            </w:r>
+          </w:p>
+        </w:tc>
+        <w:tc>
+          <w:p>
+            <w:pPr>
+              <w:pStyle w:val="Compact"/>
+              <w:jc w:val="left"/>
+            </w:pPr>
+            <w:r>
+              <w:t xml:space="preserve">seattle</w:t>
+            </w:r>
+          </w:p>
+        </w:tc>
+        <w:tc>
+          <w:p>
+            <w:pPr>
+              <w:pStyle w:val="Compact"/>
+              <w:jc w:val="left"/>
+            </w:pPr>
+            <w:r>
+              <w:t xml:space="preserve">hgbt</w:t>
+            </w:r>
+          </w:p>
+        </w:tc>
+        <w:tc>
+          <w:p>
+            <w:pPr>
+              <w:pStyle w:val="Compact"/>
+              <w:jc w:val="left"/>
+            </w:pPr>
+            <w:r>
+              <w:t xml:space="preserve">+0.4439</w:t>
+            </w:r>
+          </w:p>
+        </w:tc>
+        <w:tc>
+          <w:p>
+            <w:pPr>
+              <w:pStyle w:val="Compact"/>
+              <w:jc w:val="left"/>
+            </w:pPr>
+            <w:r>
+              <w:t xml:space="preserve">[+0.3545, +0.5174]</w:t>
+            </w:r>
+          </w:p>
+        </w:tc>
+        <w:tc>
+          <w:p>
+            <w:pPr>
+              <w:pStyle w:val="Compact"/>
+              <w:jc w:val="left"/>
+            </w:pPr>
+            <w:r>
+              <w:t xml:space="preserve">0.0000</w:t>
+            </w:r>
+          </w:p>
+        </w:tc>
+        <w:tc>
+          <w:p>
+            <w:pPr>
+              <w:pStyle w:val="Compact"/>
+              <w:jc w:val="left"/>
+            </w:pPr>
+            <w:r>
+              <w:t xml:space="preserve">1.0000</w:t>
+            </w:r>
+          </w:p>
+        </w:tc>
+        <w:tc>
+          <w:p>
+            <w:pPr>
+              <w:pStyle w:val="Compact"/>
+              <w:jc w:val="left"/>
+            </w:pPr>
+            <w:r>
+              <w:t xml:space="preserve">statistically_supported_positive_transfer</w:t>
+            </w:r>
+          </w:p>
+        </w:tc>
+      </w:tr>
+      <w:tr>
+        <w:tc>
+          <w:p>
+            <w:pPr>
+              <w:pStyle w:val="Compact"/>
+              <w:jc w:val="left"/>
+            </w:pPr>
+            <w:r>
+              <w:t xml:space="preserve">seattle</w:t>
+            </w:r>
+          </w:p>
+        </w:tc>
+        <w:tc>
+          <w:p>
+            <w:pPr>
+              <w:pStyle w:val="Compact"/>
+              <w:jc w:val="left"/>
+            </w:pPr>
+            <w:r>
+              <w:t xml:space="preserve">houston</w:t>
+            </w:r>
+          </w:p>
+        </w:tc>
+        <w:tc>
+          <w:p>
+            <w:pPr>
+              <w:pStyle w:val="Compact"/>
+              <w:jc w:val="left"/>
+            </w:pPr>
+            <w:r>
+              <w:t xml:space="preserve">extra_trees</w:t>
+            </w:r>
+          </w:p>
+        </w:tc>
+        <w:tc>
+          <w:p>
+            <w:pPr>
+              <w:pStyle w:val="Compact"/>
+              <w:jc w:val="left"/>
+            </w:pPr>
+            <w:r>
+              <w:t xml:space="preserve">+0.0021</w:t>
+            </w:r>
+          </w:p>
+        </w:tc>
+        <w:tc>
+          <w:p>
+            <w:pPr>
+              <w:pStyle w:val="Compact"/>
+              <w:jc w:val="left"/>
+            </w:pPr>
+            <w:r>
+              <w:t xml:space="preserve">[-0.0977, +0.1154]</w:t>
+            </w:r>
+          </w:p>
+        </w:tc>
+        <w:tc>
+          <w:p>
+            <w:pPr>
+              <w:pStyle w:val="Compact"/>
+              <w:jc w:val="left"/>
+            </w:pPr>
+            <w:r>
+              <w:t xml:space="preserve">0.9670</w:t>
+            </w:r>
+          </w:p>
+        </w:tc>
+        <w:tc>
+          <w:p>
+            <w:pPr>
+              <w:pStyle w:val="Compact"/>
+              <w:jc w:val="left"/>
+            </w:pPr>
+            <w:r>
+              <w:t xml:space="preserve">0.5165</w:t>
+            </w:r>
+          </w:p>
+        </w:tc>
+        <w:tc>
+          <w:p>
+            <w:pPr>
+              <w:pStyle w:val="Compact"/>
+              <w:jc w:val="left"/>
+            </w:pPr>
+            <w:r>
+              <w:t xml:space="preserve">not_conclusive</w:t>
+            </w:r>
+          </w:p>
+        </w:tc>
+      </w:tr>
+      <w:tr>
+        <w:tc>
+          <w:p>
+            <w:pPr>
+              <w:pStyle w:val="Compact"/>
+              <w:jc w:val="left"/>
+            </w:pPr>
+            <w:r>
+              <w:t xml:space="preserve">seattle</w:t>
+            </w:r>
+          </w:p>
+        </w:tc>
+        <w:tc>
+          <w:p>
+            <w:pPr>
+              <w:pStyle w:val="Compact"/>
+              <w:jc w:val="left"/>
+            </w:pPr>
+            <w:r>
+              <w:t xml:space="preserve">nola</w:t>
+            </w:r>
+          </w:p>
+        </w:tc>
+        <w:tc>
+          <w:p>
+            <w:pPr>
+              <w:pStyle w:val="Compact"/>
+              <w:jc w:val="left"/>
+            </w:pPr>
+            <w:r>
+              <w:t xml:space="preserve">extra_trees</w:t>
+            </w:r>
+          </w:p>
+        </w:tc>
+        <w:tc>
+          <w:p>
+            <w:pPr>
+              <w:pStyle w:val="Compact"/>
+              <w:jc w:val="left"/>
+            </w:pPr>
+            <w:r>
+              <w:t xml:space="preserve">+0.0488</w:t>
+            </w:r>
+          </w:p>
+        </w:tc>
+        <w:tc>
+          <w:p>
+            <w:pPr>
+              <w:pStyle w:val="Compact"/>
+              <w:jc w:val="left"/>
+            </w:pPr>
+            <w:r>
+              <w:t xml:space="preserve">[-0.0393, +0.1521]</w:t>
+            </w:r>
+          </w:p>
+        </w:tc>
+        <w:tc>
+          <w:p>
+            <w:pPr>
+              <w:pStyle w:val="Compact"/>
+              <w:jc w:val="left"/>
+            </w:pPr>
+            <w:r>
+              <w:t xml:space="preserve">0.2960</w:t>
+            </w:r>
+          </w:p>
+        </w:tc>
+        <w:tc>
+          <w:p>
+            <w:pPr>
+              <w:pStyle w:val="Compact"/>
+              <w:jc w:val="left"/>
+            </w:pPr>
+            <w:r>
+              <w:t xml:space="preserve">0.8520</w:t>
+            </w:r>
+          </w:p>
+        </w:tc>
+        <w:tc>
+          <w:p>
+            <w:pPr>
+              <w:pStyle w:val="Compact"/>
+              <w:jc w:val="left"/>
+            </w:pPr>
+            <w:r>
+              <w:t xml:space="preserve">not_conclusive</w:t>
+            </w:r>
+          </w:p>
+        </w:tc>
+      </w:tr>
+    </w:tbl>
+    <w:p>
+      <w:pPr>
+        <w:pStyle w:val="BodyText"/>
+      </w:pPr>
+      <w:r>
+        <w:t xml:space="preserve">Key interpretation:</w:t>
+      </w:r>
+      <w:r>
+        <w:t xml:space="preserve"> </w:t>
+      </w:r>
+      <w:r>
+        <w:t xml:space="preserve">- houston-&gt;nola: ΔF1=-0.1383, bootstrap p=0.0000, direction_prob=1.0000</w:t>
+      </w:r>
+      <w:r>
+        <w:t xml:space="preserve"> </w:t>
+      </w:r>
+      <w:r>
+        <w:t xml:space="preserve">- houston-&gt;seattle: ΔF1=-0.2103, bootstrap p=0.0000, direction_prob=1.0000</w:t>
+      </w:r>
+      <w:r>
+        <w:t xml:space="preserve"> </w:t>
+      </w:r>
+      <w:r>
+        <w:t xml:space="preserve">- nola-&gt;houston: ΔF1=+0.3213, bootstrap p=0.0000, direction_prob=1.0000</w:t>
+      </w:r>
+      <w:r>
+        <w:t xml:space="preserve"> </w:t>
+      </w:r>
+      <w:r>
+        <w:t xml:space="preserve">- nola-&gt;seattle: ΔF1=+0.4439, bootstrap p=0.0000, direction_prob=1.0000</w:t>
+      </w:r>
+      <w:r>
+        <w:t xml:space="preserve"> </w:t>
+      </w:r>
+      <w:r>
+        <w:t xml:space="preserve">- seattle-&gt;houston: ΔF1=+0.0021, bootstrap p=0.9670, direction_prob=0.5165</w:t>
+      </w:r>
+      <w:r>
+        <w:t xml:space="preserve"> </w:t>
+      </w:r>
+      <w:r>
+        <w:t xml:space="preserve">- seattle-&gt;nola: ΔF1=+0.0488, bootstrap p=0.2960, direction_prob=0.8520</w:t>
+      </w:r>
+    </w:p>
     <w:bookmarkEnd w:id="42"/>
+    <w:bookmarkEnd w:id="43"/>
     <w:sectPr/>
   </w:body>
 </w:document>
@@ -4680,6 +5423,9 @@
     <w:abstractNumId w:val="991"/>
   </w:num>
   <w:num w:numId="1014">
+    <w:abstractNumId w:val="991"/>
+  </w:num>
+  <w:num w:numId="1015">
     <w:abstractNumId w:val="991"/>
   </w:num>
 </w:numbering>

</xml_diff>

<commit_message>
feat: add bilingual parity report and auto-check TODO
</commit_message>
<xml_diff>
--- a/docs/manuscript/v0.2_2026-04-09/manuscript_draft_v0.2_2026-04-09_en.docx
+++ b/docs/manuscript/v0.2_2026-04-09/manuscript_draft_v0.2_2026-04-09_en.docx
@@ -3883,6 +3883,27 @@
           <w:rStyle w:val="VerbatimChar"/>
         </w:rPr>
         <w:t xml:space="preserve">manuscript_consistency_report_v0.2_2026-04-09.md</w:t>
+      </w:r>
+    </w:p>
+    <w:p>
+      <w:pPr>
+        <w:numPr>
+          <w:ilvl w:val="0"/>
+          <w:numId w:val="1011"/>
+        </w:numPr>
+        <w:pStyle w:val="Compact"/>
+      </w:pPr>
+      <w:r>
+        <w:t xml:space="preserve">Bilingual parity report:</w:t>
+      </w:r>
+      <w:r>
+        <w:t xml:space="preserve"> </w:t>
+      </w:r>
+      <w:r>
+        <w:rPr>
+          <w:rStyle w:val="VerbatimChar"/>
+        </w:rPr>
+        <w:t xml:space="preserve">bilingual_parity_report_v0.2_2026-04-09.md</w:t>
       </w:r>
     </w:p>
     <w:p>

</xml_diff>

<commit_message>
Add repeated-randomization transfer significance appendix
</commit_message>
<xml_diff>
--- a/docs/manuscript/v0.2_2026-04-09/manuscript_draft_v0.2_2026-04-09_en.docx
+++ b/docs/manuscript/v0.2_2026-04-09/manuscript_draft_v0.2_2026-04-09_en.docx
@@ -2,7 +2,7 @@
 <file path=word/document.xml><?xml version="1.0" encoding="utf-8"?>
 <w:document xmlns:w="http://schemas.openxmlformats.org/wordprocessingml/2006/main" xmlns:m="http://schemas.openxmlformats.org/officeDocument/2006/math" xmlns:r="http://schemas.openxmlformats.org/officeDocument/2006/relationships" xmlns:o="urn:schemas-microsoft-com:office:office" xmlns:v="urn:schemas-microsoft-com:vml" xmlns:w10="urn:schemas-microsoft-com:office:word" xmlns:a="http://schemas.openxmlformats.org/drawingml/2006/main" xmlns:pic="http://schemas.openxmlformats.org/drawingml/2006/picture" xmlns:wp="http://schemas.openxmlformats.org/drawingml/2006/wordprocessingDrawing">
   <w:body>
-    <w:bookmarkStart w:id="46" w:name="X9cf75eb6c88c04ea3d3656b65c138eab314f5a4"/>
+    <w:bookmarkStart w:id="47" w:name="X9cf75eb6c88c04ea3d3656b65c138eab314f5a4"/>
     <w:p>
       <w:pPr>
         <w:pStyle w:val="Heading1"/>
@@ -4466,6 +4466,27 @@
         <w:pStyle w:val="Compact"/>
       </w:pPr>
       <w:r>
+        <w:t xml:space="preserve">Transfer repeated-randomization appendix:</w:t>
+      </w:r>
+      <w:r>
+        <w:t xml:space="preserve"> </w:t>
+      </w:r>
+      <w:r>
+        <w:rPr>
+          <w:rStyle w:val="VerbatimChar"/>
+        </w:rPr>
+        <w:t xml:space="preserve">transfer_route_repeated_randomization_appendix_v0.2_2026-04-09.md</w:t>
+      </w:r>
+    </w:p>
+    <w:p>
+      <w:pPr>
+        <w:numPr>
+          <w:ilvl w:val="0"/>
+          <w:numId w:val="1012"/>
+        </w:numPr>
+        <w:pStyle w:val="Compact"/>
+      </w:pPr>
+      <w:r>
         <w:t xml:space="preserve">Out-of-domain validation appendix:</w:t>
       </w:r>
       <w:r>
@@ -5847,13 +5868,13 @@
       </w:r>
     </w:p>
     <w:bookmarkEnd w:id="44"/>
-    <w:bookmarkStart w:id="45" w:name="X87628fc250d7b1867276627138d9078c8975729"/>
+    <w:bookmarkStart w:id="45" w:name="Xca035c03012a94c8557586c34d9817ef00c193c"/>
     <w:p>
       <w:pPr>
         <w:pStyle w:val="Heading2"/>
       </w:pPr>
       <w:r>
-        <w:t xml:space="preserve">16. Threshold Utility Appendix (Operational Cost Profile)</w:t>
+        <w:t xml:space="preserve">16. Transfer-Route Repeated-Randomization Appendix</w:t>
       </w:r>
     </w:p>
     <w:p>
@@ -5865,7 +5886,7 @@
         <w:pStyle w:val="Compact"/>
       </w:pPr>
       <w:r>
-        <w:t xml:space="preserve">Utility-curve CSV:</w:t>
+        <w:t xml:space="preserve">Repeated-randomization significance CSV:</w:t>
       </w:r>
       <w:r>
         <w:t xml:space="preserve"> </w:t>
@@ -5874,7 +5895,7 @@
         <w:rPr>
           <w:rStyle w:val="VerbatimChar"/>
         </w:rPr>
-        <w:t xml:space="preserve">threshold_utility_curve_summary.csv</w:t>
+        <w:t xml:space="preserve">transfer_route_repeated_randomization_significance_summary.csv</w:t>
       </w:r>
     </w:p>
     <w:p>
@@ -5886,7 +5907,7 @@
         <w:pStyle w:val="Compact"/>
       </w:pPr>
       <w:r>
-        <w:t xml:space="preserve">Operating-point CSV:</w:t>
+        <w:t xml:space="preserve">Appendix document:</w:t>
       </w:r>
       <w:r>
         <w:t xml:space="preserve"> </w:t>
@@ -5895,28 +5916,7 @@
         <w:rPr>
           <w:rStyle w:val="VerbatimChar"/>
         </w:rPr>
-        <w:t xml:space="preserve">threshold_utility_operating_points.csv</w:t>
-      </w:r>
-    </w:p>
-    <w:p>
-      <w:pPr>
-        <w:numPr>
-          <w:ilvl w:val="0"/>
-          <w:numId w:val="1017"/>
-        </w:numPr>
-        <w:pStyle w:val="Compact"/>
-      </w:pPr>
-      <w:r>
-        <w:t xml:space="preserve">Utility appendix document:</w:t>
-      </w:r>
-      <w:r>
-        <w:t xml:space="preserve"> </w:t>
-      </w:r>
-      <w:r>
-        <w:rPr>
-          <w:rStyle w:val="VerbatimChar"/>
-        </w:rPr>
-        <w:t xml:space="preserve">threshold_utility_appendix_v0.2_2026-04-09.md</w:t>
+        <w:t xml:space="preserve">transfer_route_repeated_randomization_appendix_v0.2_2026-04-09.md</w:t>
       </w:r>
     </w:p>
     <w:tbl>
@@ -5947,128 +5947,128 @@
               <w:jc w:val="left"/>
             </w:pPr>
             <w:r>
-              <w:t xml:space="preserve">region</w:t>
-            </w:r>
-          </w:p>
-        </w:tc>
-        <w:tc>
-          <w:p>
-            <w:pPr>
-              <w:pStyle w:val="Compact"/>
-              <w:jc w:val="left"/>
-            </w:pPr>
-            <w:r>
-              <w:t xml:space="preserve">model_name</w:t>
-            </w:r>
-          </w:p>
-        </w:tc>
-        <w:tc>
-          <w:p>
-            <w:pPr>
-              <w:pStyle w:val="Compact"/>
-              <w:jc w:val="left"/>
-            </w:pPr>
-            <w:r>
-              <w:t xml:space="preserve">governed_threshold</w:t>
-            </w:r>
-          </w:p>
-        </w:tc>
-        <w:tc>
-          <w:p>
-            <w:pPr>
-              <w:pStyle w:val="Compact"/>
-              <w:jc w:val="left"/>
-            </w:pPr>
-            <w:r>
-              <w:t xml:space="preserve">utility_opt_threshold</w:t>
-            </w:r>
-          </w:p>
-        </w:tc>
-        <w:tc>
-          <w:p>
-            <w:pPr>
-              <w:pStyle w:val="Compact"/>
-              <w:jc w:val="left"/>
-            </w:pPr>
-            <w:r>
-              <w:t xml:space="preserve">threshold_shift</w:t>
-            </w:r>
-          </w:p>
-        </w:tc>
-        <w:tc>
-          <w:p>
-            <w:pPr>
-              <w:pStyle w:val="Compact"/>
-              <w:jc w:val="left"/>
-            </w:pPr>
-            <w:r>
-              <w:t xml:space="preserve">governed_f1</w:t>
-            </w:r>
-          </w:p>
-        </w:tc>
-        <w:tc>
-          <w:p>
-            <w:pPr>
-              <w:pStyle w:val="Compact"/>
-              <w:jc w:val="left"/>
-            </w:pPr>
-            <w:r>
-              <w:t xml:space="preserve">opt_f1</w:t>
-            </w:r>
-          </w:p>
-        </w:tc>
-        <w:tc>
-          <w:p>
-            <w:pPr>
-              <w:pStyle w:val="Compact"/>
-              <w:jc w:val="left"/>
-            </w:pPr>
-            <w:r>
-              <w:t xml:space="preserve">cost_reduction_pct</w:t>
-            </w:r>
-          </w:p>
-        </w:tc>
-        <w:tc>
-          <w:p>
-            <w:pPr>
-              <w:pStyle w:val="Compact"/>
-              <w:jc w:val="left"/>
-            </w:pPr>
-            <w:r>
-              <w:t xml:space="preserve">governed_fp</w:t>
-            </w:r>
-          </w:p>
-        </w:tc>
-        <w:tc>
-          <w:p>
-            <w:pPr>
-              <w:pStyle w:val="Compact"/>
-              <w:jc w:val="left"/>
-            </w:pPr>
-            <w:r>
-              <w:t xml:space="preserve">governed_fn</w:t>
-            </w:r>
-          </w:p>
-        </w:tc>
-        <w:tc>
-          <w:p>
-            <w:pPr>
-              <w:pStyle w:val="Compact"/>
-              <w:jc w:val="left"/>
-            </w:pPr>
-            <w:r>
-              <w:t xml:space="preserve">opt_fp</w:t>
-            </w:r>
-          </w:p>
-        </w:tc>
-        <w:tc>
-          <w:p>
-            <w:pPr>
-              <w:pStyle w:val="Compact"/>
-              <w:jc w:val="left"/>
-            </w:pPr>
-            <w:r>
-              <w:t xml:space="preserve">opt_fn</w:t>
+              <w:t xml:space="preserve">source_region</w:t>
+            </w:r>
+          </w:p>
+        </w:tc>
+        <w:tc>
+          <w:p>
+            <w:pPr>
+              <w:pStyle w:val="Compact"/>
+              <w:jc w:val="left"/>
+            </w:pPr>
+            <w:r>
+              <w:t xml:space="preserve">target_region</w:t>
+            </w:r>
+          </w:p>
+        </w:tc>
+        <w:tc>
+          <w:p>
+            <w:pPr>
+              <w:pStyle w:val="Compact"/>
+              <w:jc w:val="left"/>
+            </w:pPr>
+            <w:r>
+              <w:t xml:space="preserve">recommended_model</w:t>
+            </w:r>
+          </w:p>
+        </w:tc>
+        <w:tc>
+          <w:p>
+            <w:pPr>
+              <w:pStyle w:val="Compact"/>
+              <w:jc w:val="left"/>
+            </w:pPr>
+            <w:r>
+              <w:t xml:space="preserve">observed_delta_f1</w:t>
+            </w:r>
+          </w:p>
+        </w:tc>
+        <w:tc>
+          <w:p>
+            <w:pPr>
+              <w:pStyle w:val="Compact"/>
+              <w:jc w:val="left"/>
+            </w:pPr>
+            <w:r>
+              <w:t xml:space="preserve">randomization_runs</w:t>
+            </w:r>
+          </w:p>
+        </w:tc>
+        <w:tc>
+          <w:p>
+            <w:pPr>
+              <w:pStyle w:val="Compact"/>
+              <w:jc w:val="left"/>
+            </w:pPr>
+            <w:r>
+              <w:t xml:space="preserve">delta_mean_across_runs</w:t>
+            </w:r>
+          </w:p>
+        </w:tc>
+        <w:tc>
+          <w:p>
+            <w:pPr>
+              <w:pStyle w:val="Compact"/>
+              <w:jc w:val="left"/>
+            </w:pPr>
+            <w:r>
+              <w:t xml:space="preserve">delta_ci95_pooled</w:t>
+            </w:r>
+          </w:p>
+        </w:tc>
+        <w:tc>
+          <w:p>
+            <w:pPr>
+              <w:pStyle w:val="Compact"/>
+              <w:jc w:val="left"/>
+            </w:pPr>
+            <w:r>
+              <w:t xml:space="preserve">p_two_sided_median</w:t>
+            </w:r>
+          </w:p>
+        </w:tc>
+        <w:tc>
+          <w:p>
+            <w:pPr>
+              <w:pStyle w:val="Compact"/>
+              <w:jc w:val="left"/>
+            </w:pPr>
+            <w:r>
+              <w:t xml:space="preserve">p_two_sided_median_holm</w:t>
+            </w:r>
+          </w:p>
+        </w:tc>
+        <w:tc>
+          <w:p>
+            <w:pPr>
+              <w:pStyle w:val="Compact"/>
+              <w:jc w:val="left"/>
+            </w:pPr>
+            <w:r>
+              <w:t xml:space="preserve">direction_consistency</w:t>
+            </w:r>
+          </w:p>
+        </w:tc>
+        <w:tc>
+          <w:p>
+            <w:pPr>
+              <w:pStyle w:val="Compact"/>
+              <w:jc w:val="left"/>
+            </w:pPr>
+            <w:r>
+              <w:t xml:space="preserve">significant_runs</w:t>
+            </w:r>
+          </w:p>
+        </w:tc>
+        <w:tc>
+          <w:p>
+            <w:pPr>
+              <w:pStyle w:val="Compact"/>
+              <w:jc w:val="left"/>
+            </w:pPr>
+            <w:r>
+              <w:t xml:space="preserve">interpretation</w:t>
             </w:r>
           </w:p>
         </w:tc>
@@ -6092,6 +6092,17 @@
               <w:jc w:val="left"/>
             </w:pPr>
             <w:r>
+              <w:t xml:space="preserve">nola</w:t>
+            </w:r>
+          </w:p>
+        </w:tc>
+        <w:tc>
+          <w:p>
+            <w:pPr>
+              <w:pStyle w:val="Compact"/>
+              <w:jc w:val="left"/>
+            </w:pPr>
+            <w:r>
               <w:t xml:space="preserve">hgbt</w:t>
             </w:r>
           </w:p>
@@ -6103,106 +6114,95 @@
               <w:jc w:val="left"/>
             </w:pPr>
             <w:r>
-              <w:t xml:space="preserve">0.95</w:t>
-            </w:r>
-          </w:p>
-        </w:tc>
-        <w:tc>
-          <w:p>
-            <w:pPr>
-              <w:pStyle w:val="Compact"/>
-              <w:jc w:val="left"/>
-            </w:pPr>
-            <w:r>
-              <w:t xml:space="preserve">0.05</w:t>
-            </w:r>
-          </w:p>
-        </w:tc>
-        <w:tc>
-          <w:p>
-            <w:pPr>
-              <w:pStyle w:val="Compact"/>
-              <w:jc w:val="left"/>
-            </w:pPr>
-            <w:r>
-              <w:t xml:space="preserve">-0.90</w:t>
-            </w:r>
-          </w:p>
-        </w:tc>
-        <w:tc>
-          <w:p>
-            <w:pPr>
-              <w:pStyle w:val="Compact"/>
-              <w:jc w:val="left"/>
-            </w:pPr>
-            <w:r>
-              <w:t xml:space="preserve">0.8286</w:t>
-            </w:r>
-          </w:p>
-        </w:tc>
-        <w:tc>
-          <w:p>
-            <w:pPr>
-              <w:pStyle w:val="Compact"/>
-              <w:jc w:val="left"/>
-            </w:pPr>
-            <w:r>
-              <w:t xml:space="preserve">0.8372</w:t>
-            </w:r>
-          </w:p>
-        </w:tc>
-        <w:tc>
-          <w:p>
-            <w:pPr>
-              <w:pStyle w:val="Compact"/>
-              <w:jc w:val="left"/>
-            </w:pPr>
-            <w:r>
-              <w:t xml:space="preserve">+46.43</w:t>
-            </w:r>
-          </w:p>
-        </w:tc>
-        <w:tc>
-          <w:p>
-            <w:pPr>
-              <w:pStyle w:val="Compact"/>
-              <w:jc w:val="left"/>
-            </w:pPr>
-            <w:r>
-              <w:t xml:space="preserve">1</w:t>
-            </w:r>
-          </w:p>
-        </w:tc>
-        <w:tc>
-          <w:p>
-            <w:pPr>
-              <w:pStyle w:val="Compact"/>
-              <w:jc w:val="left"/>
-            </w:pPr>
-            <w:r>
-              <w:t xml:space="preserve">11</w:t>
-            </w:r>
-          </w:p>
-        </w:tc>
-        <w:tc>
-          <w:p>
-            <w:pPr>
-              <w:pStyle w:val="Compact"/>
-              <w:jc w:val="left"/>
-            </w:pPr>
-            <w:r>
-              <w:t xml:space="preserve">10</w:t>
-            </w:r>
-          </w:p>
-        </w:tc>
-        <w:tc>
-          <w:p>
-            <w:pPr>
-              <w:pStyle w:val="Compact"/>
-              <w:jc w:val="left"/>
-            </w:pPr>
-            <w:r>
-              <w:t xml:space="preserve">4</w:t>
+              <w:t xml:space="preserve">-0.1383</w:t>
+            </w:r>
+          </w:p>
+        </w:tc>
+        <w:tc>
+          <w:p>
+            <w:pPr>
+              <w:pStyle w:val="Compact"/>
+              <w:jc w:val="left"/>
+            </w:pPr>
+            <w:r>
+              <w:t xml:space="preserve">25</w:t>
+            </w:r>
+          </w:p>
+        </w:tc>
+        <w:tc>
+          <w:p>
+            <w:pPr>
+              <w:pStyle w:val="Compact"/>
+              <w:jc w:val="left"/>
+            </w:pPr>
+            <w:r>
+              <w:t xml:space="preserve">-0.1383</w:t>
+            </w:r>
+          </w:p>
+        </w:tc>
+        <w:tc>
+          <w:p>
+            <w:pPr>
+              <w:pStyle w:val="Compact"/>
+              <w:jc w:val="left"/>
+            </w:pPr>
+            <w:r>
+              <w:t xml:space="preserve">[-0.1630, -0.1149]</w:t>
+            </w:r>
+          </w:p>
+        </w:tc>
+        <w:tc>
+          <w:p>
+            <w:pPr>
+              <w:pStyle w:val="Compact"/>
+              <w:jc w:val="left"/>
+            </w:pPr>
+            <w:r>
+              <w:t xml:space="preserve">0.0000</w:t>
+            </w:r>
+          </w:p>
+        </w:tc>
+        <w:tc>
+          <w:p>
+            <w:pPr>
+              <w:pStyle w:val="Compact"/>
+              <w:jc w:val="left"/>
+            </w:pPr>
+            <w:r>
+              <w:t xml:space="preserve">0.0000</w:t>
+            </w:r>
+          </w:p>
+        </w:tc>
+        <w:tc>
+          <w:p>
+            <w:pPr>
+              <w:pStyle w:val="Compact"/>
+              <w:jc w:val="left"/>
+            </w:pPr>
+            <w:r>
+              <w:t xml:space="preserve">1.0000</w:t>
+            </w:r>
+          </w:p>
+        </w:tc>
+        <w:tc>
+          <w:p>
+            <w:pPr>
+              <w:pStyle w:val="Compact"/>
+              <w:jc w:val="left"/>
+            </w:pPr>
+            <w:r>
+              <w:t xml:space="preserve">25</w:t>
+            </w:r>
+          </w:p>
+        </w:tc>
+        <w:tc>
+          <w:p>
+            <w:pPr>
+              <w:pStyle w:val="Compact"/>
+              <w:jc w:val="left"/>
+            </w:pPr>
+            <w:r>
+              <w:t xml:space="preserve">statistically_supported_after_holm</w:t>
             </w:r>
           </w:p>
         </w:tc>
@@ -6215,7 +6215,18 @@
               <w:jc w:val="left"/>
             </w:pPr>
             <w:r>
-              <w:t xml:space="preserve">nola</w:t>
+              <w:t xml:space="preserve">houston</w:t>
+            </w:r>
+          </w:p>
+        </w:tc>
+        <w:tc>
+          <w:p>
+            <w:pPr>
+              <w:pStyle w:val="Compact"/>
+              <w:jc w:val="left"/>
+            </w:pPr>
+            <w:r>
+              <w:t xml:space="preserve">seattle</w:t>
             </w:r>
           </w:p>
         </w:tc>
@@ -6237,106 +6248,95 @@
               <w:jc w:val="left"/>
             </w:pPr>
             <w:r>
-              <w:t xml:space="preserve">0.35</w:t>
-            </w:r>
-          </w:p>
-        </w:tc>
-        <w:tc>
-          <w:p>
-            <w:pPr>
-              <w:pStyle w:val="Compact"/>
-              <w:jc w:val="left"/>
-            </w:pPr>
-            <w:r>
-              <w:t xml:space="preserve">0.38</w:t>
-            </w:r>
-          </w:p>
-        </w:tc>
-        <w:tc>
-          <w:p>
-            <w:pPr>
-              <w:pStyle w:val="Compact"/>
-              <w:jc w:val="left"/>
-            </w:pPr>
-            <w:r>
-              <w:t xml:space="preserve">+0.03</w:t>
-            </w:r>
-          </w:p>
-        </w:tc>
-        <w:tc>
-          <w:p>
-            <w:pPr>
-              <w:pStyle w:val="Compact"/>
-              <w:jc w:val="left"/>
-            </w:pPr>
-            <w:r>
-              <w:t xml:space="preserve">0.6015</w:t>
-            </w:r>
-          </w:p>
-        </w:tc>
-        <w:tc>
-          <w:p>
-            <w:pPr>
-              <w:pStyle w:val="Compact"/>
-              <w:jc w:val="left"/>
-            </w:pPr>
-            <w:r>
-              <w:t xml:space="preserve">0.6250</w:t>
-            </w:r>
-          </w:p>
-        </w:tc>
-        <w:tc>
-          <w:p>
-            <w:pPr>
-              <w:pStyle w:val="Compact"/>
-              <w:jc w:val="left"/>
-            </w:pPr>
-            <w:r>
-              <w:t xml:space="preserve">+5.38</w:t>
-            </w:r>
-          </w:p>
-        </w:tc>
-        <w:tc>
-          <w:p>
-            <w:pPr>
-              <w:pStyle w:val="Compact"/>
-              <w:jc w:val="left"/>
-            </w:pPr>
-            <w:r>
-              <w:t xml:space="preserve">43</w:t>
-            </w:r>
-          </w:p>
-        </w:tc>
-        <w:tc>
-          <w:p>
-            <w:pPr>
-              <w:pStyle w:val="Compact"/>
-              <w:jc w:val="left"/>
-            </w:pPr>
-            <w:r>
-              <w:t xml:space="preserve">10</w:t>
-            </w:r>
-          </w:p>
-        </w:tc>
-        <w:tc>
-          <w:p>
-            <w:pPr>
-              <w:pStyle w:val="Compact"/>
-              <w:jc w:val="left"/>
-            </w:pPr>
-            <w:r>
-              <w:t xml:space="preserve">38</w:t>
-            </w:r>
-          </w:p>
-        </w:tc>
-        <w:tc>
-          <w:p>
-            <w:pPr>
-              <w:pStyle w:val="Compact"/>
-              <w:jc w:val="left"/>
-            </w:pPr>
-            <w:r>
-              <w:t xml:space="preserve">10</w:t>
+              <w:t xml:space="preserve">-0.2103</w:t>
+            </w:r>
+          </w:p>
+        </w:tc>
+        <w:tc>
+          <w:p>
+            <w:pPr>
+              <w:pStyle w:val="Compact"/>
+              <w:jc w:val="left"/>
+            </w:pPr>
+            <w:r>
+              <w:t xml:space="preserve">25</w:t>
+            </w:r>
+          </w:p>
+        </w:tc>
+        <w:tc>
+          <w:p>
+            <w:pPr>
+              <w:pStyle w:val="Compact"/>
+              <w:jc w:val="left"/>
+            </w:pPr>
+            <w:r>
+              <w:t xml:space="preserve">-0.2103</w:t>
+            </w:r>
+          </w:p>
+        </w:tc>
+        <w:tc>
+          <w:p>
+            <w:pPr>
+              <w:pStyle w:val="Compact"/>
+              <w:jc w:val="left"/>
+            </w:pPr>
+            <w:r>
+              <w:t xml:space="preserve">[-0.2429, -0.1783]</w:t>
+            </w:r>
+          </w:p>
+        </w:tc>
+        <w:tc>
+          <w:p>
+            <w:pPr>
+              <w:pStyle w:val="Compact"/>
+              <w:jc w:val="left"/>
+            </w:pPr>
+            <w:r>
+              <w:t xml:space="preserve">0.0000</w:t>
+            </w:r>
+          </w:p>
+        </w:tc>
+        <w:tc>
+          <w:p>
+            <w:pPr>
+              <w:pStyle w:val="Compact"/>
+              <w:jc w:val="left"/>
+            </w:pPr>
+            <w:r>
+              <w:t xml:space="preserve">0.0000</w:t>
+            </w:r>
+          </w:p>
+        </w:tc>
+        <w:tc>
+          <w:p>
+            <w:pPr>
+              <w:pStyle w:val="Compact"/>
+              <w:jc w:val="left"/>
+            </w:pPr>
+            <w:r>
+              <w:t xml:space="preserve">1.0000</w:t>
+            </w:r>
+          </w:p>
+        </w:tc>
+        <w:tc>
+          <w:p>
+            <w:pPr>
+              <w:pStyle w:val="Compact"/>
+              <w:jc w:val="left"/>
+            </w:pPr>
+            <w:r>
+              <w:t xml:space="preserve">25</w:t>
+            </w:r>
+          </w:p>
+        </w:tc>
+        <w:tc>
+          <w:p>
+            <w:pPr>
+              <w:pStyle w:val="Compact"/>
+              <w:jc w:val="left"/>
+            </w:pPr>
+            <w:r>
+              <w:t xml:space="preserve">statistically_supported_after_holm</w:t>
             </w:r>
           </w:p>
         </w:tc>
@@ -6349,6 +6349,151 @@
               <w:jc w:val="left"/>
             </w:pPr>
             <w:r>
+              <w:t xml:space="preserve">nola</w:t>
+            </w:r>
+          </w:p>
+        </w:tc>
+        <w:tc>
+          <w:p>
+            <w:pPr>
+              <w:pStyle w:val="Compact"/>
+              <w:jc w:val="left"/>
+            </w:pPr>
+            <w:r>
+              <w:t xml:space="preserve">houston</w:t>
+            </w:r>
+          </w:p>
+        </w:tc>
+        <w:tc>
+          <w:p>
+            <w:pPr>
+              <w:pStyle w:val="Compact"/>
+              <w:jc w:val="left"/>
+            </w:pPr>
+            <w:r>
+              <w:t xml:space="preserve">hgbt</w:t>
+            </w:r>
+          </w:p>
+        </w:tc>
+        <w:tc>
+          <w:p>
+            <w:pPr>
+              <w:pStyle w:val="Compact"/>
+              <w:jc w:val="left"/>
+            </w:pPr>
+            <w:r>
+              <w:t xml:space="preserve">+0.3213</w:t>
+            </w:r>
+          </w:p>
+        </w:tc>
+        <w:tc>
+          <w:p>
+            <w:pPr>
+              <w:pStyle w:val="Compact"/>
+              <w:jc w:val="left"/>
+            </w:pPr>
+            <w:r>
+              <w:t xml:space="preserve">25</w:t>
+            </w:r>
+          </w:p>
+        </w:tc>
+        <w:tc>
+          <w:p>
+            <w:pPr>
+              <w:pStyle w:val="Compact"/>
+              <w:jc w:val="left"/>
+            </w:pPr>
+            <w:r>
+              <w:t xml:space="preserve">+0.3197</w:t>
+            </w:r>
+          </w:p>
+        </w:tc>
+        <w:tc>
+          <w:p>
+            <w:pPr>
+              <w:pStyle w:val="Compact"/>
+              <w:jc w:val="left"/>
+            </w:pPr>
+            <w:r>
+              <w:t xml:space="preserve">[+0.2316, +0.4027]</w:t>
+            </w:r>
+          </w:p>
+        </w:tc>
+        <w:tc>
+          <w:p>
+            <w:pPr>
+              <w:pStyle w:val="Compact"/>
+              <w:jc w:val="left"/>
+            </w:pPr>
+            <w:r>
+              <w:t xml:space="preserve">0.0000</w:t>
+            </w:r>
+          </w:p>
+        </w:tc>
+        <w:tc>
+          <w:p>
+            <w:pPr>
+              <w:pStyle w:val="Compact"/>
+              <w:jc w:val="left"/>
+            </w:pPr>
+            <w:r>
+              <w:t xml:space="preserve">0.0000</w:t>
+            </w:r>
+          </w:p>
+        </w:tc>
+        <w:tc>
+          <w:p>
+            <w:pPr>
+              <w:pStyle w:val="Compact"/>
+              <w:jc w:val="left"/>
+            </w:pPr>
+            <w:r>
+              <w:t xml:space="preserve">1.0000</w:t>
+            </w:r>
+          </w:p>
+        </w:tc>
+        <w:tc>
+          <w:p>
+            <w:pPr>
+              <w:pStyle w:val="Compact"/>
+              <w:jc w:val="left"/>
+            </w:pPr>
+            <w:r>
+              <w:t xml:space="preserve">25</w:t>
+            </w:r>
+          </w:p>
+        </w:tc>
+        <w:tc>
+          <w:p>
+            <w:pPr>
+              <w:pStyle w:val="Compact"/>
+              <w:jc w:val="left"/>
+            </w:pPr>
+            <w:r>
+              <w:t xml:space="preserve">statistically_supported_after_holm</w:t>
+            </w:r>
+          </w:p>
+        </w:tc>
+      </w:tr>
+      <w:tr>
+        <w:tc>
+          <w:p>
+            <w:pPr>
+              <w:pStyle w:val="Compact"/>
+              <w:jc w:val="left"/>
+            </w:pPr>
+            <w:r>
+              <w:t xml:space="preserve">nola</w:t>
+            </w:r>
+          </w:p>
+        </w:tc>
+        <w:tc>
+          <w:p>
+            <w:pPr>
+              <w:pStyle w:val="Compact"/>
+              <w:jc w:val="left"/>
+            </w:pPr>
+            <w:r>
               <w:t xml:space="preserve">seattle</w:t>
             </w:r>
           </w:p>
@@ -6360,6 +6505,140 @@
               <w:jc w:val="left"/>
             </w:pPr>
             <w:r>
+              <w:t xml:space="preserve">hgbt</w:t>
+            </w:r>
+          </w:p>
+        </w:tc>
+        <w:tc>
+          <w:p>
+            <w:pPr>
+              <w:pStyle w:val="Compact"/>
+              <w:jc w:val="left"/>
+            </w:pPr>
+            <w:r>
+              <w:t xml:space="preserve">+0.4439</w:t>
+            </w:r>
+          </w:p>
+        </w:tc>
+        <w:tc>
+          <w:p>
+            <w:pPr>
+              <w:pStyle w:val="Compact"/>
+              <w:jc w:val="left"/>
+            </w:pPr>
+            <w:r>
+              <w:t xml:space="preserve">25</w:t>
+            </w:r>
+          </w:p>
+        </w:tc>
+        <w:tc>
+          <w:p>
+            <w:pPr>
+              <w:pStyle w:val="Compact"/>
+              <w:jc w:val="left"/>
+            </w:pPr>
+            <w:r>
+              <w:t xml:space="preserve">+0.4420</w:t>
+            </w:r>
+          </w:p>
+        </w:tc>
+        <w:tc>
+          <w:p>
+            <w:pPr>
+              <w:pStyle w:val="Compact"/>
+              <w:jc w:val="left"/>
+            </w:pPr>
+            <w:r>
+              <w:t xml:space="preserve">[+0.3588, +0.5199]</w:t>
+            </w:r>
+          </w:p>
+        </w:tc>
+        <w:tc>
+          <w:p>
+            <w:pPr>
+              <w:pStyle w:val="Compact"/>
+              <w:jc w:val="left"/>
+            </w:pPr>
+            <w:r>
+              <w:t xml:space="preserve">0.0000</w:t>
+            </w:r>
+          </w:p>
+        </w:tc>
+        <w:tc>
+          <w:p>
+            <w:pPr>
+              <w:pStyle w:val="Compact"/>
+              <w:jc w:val="left"/>
+            </w:pPr>
+            <w:r>
+              <w:t xml:space="preserve">0.0000</w:t>
+            </w:r>
+          </w:p>
+        </w:tc>
+        <w:tc>
+          <w:p>
+            <w:pPr>
+              <w:pStyle w:val="Compact"/>
+              <w:jc w:val="left"/>
+            </w:pPr>
+            <w:r>
+              <w:t xml:space="preserve">1.0000</w:t>
+            </w:r>
+          </w:p>
+        </w:tc>
+        <w:tc>
+          <w:p>
+            <w:pPr>
+              <w:pStyle w:val="Compact"/>
+              <w:jc w:val="left"/>
+            </w:pPr>
+            <w:r>
+              <w:t xml:space="preserve">25</w:t>
+            </w:r>
+          </w:p>
+        </w:tc>
+        <w:tc>
+          <w:p>
+            <w:pPr>
+              <w:pStyle w:val="Compact"/>
+              <w:jc w:val="left"/>
+            </w:pPr>
+            <w:r>
+              <w:t xml:space="preserve">statistically_supported_after_holm</w:t>
+            </w:r>
+          </w:p>
+        </w:tc>
+      </w:tr>
+      <w:tr>
+        <w:tc>
+          <w:p>
+            <w:pPr>
+              <w:pStyle w:val="Compact"/>
+              <w:jc w:val="left"/>
+            </w:pPr>
+            <w:r>
+              <w:t xml:space="preserve">seattle</w:t>
+            </w:r>
+          </w:p>
+        </w:tc>
+        <w:tc>
+          <w:p>
+            <w:pPr>
+              <w:pStyle w:val="Compact"/>
+              <w:jc w:val="left"/>
+            </w:pPr>
+            <w:r>
+              <w:t xml:space="preserve">houston</w:t>
+            </w:r>
+          </w:p>
+        </w:tc>
+        <w:tc>
+          <w:p>
+            <w:pPr>
+              <w:pStyle w:val="Compact"/>
+              <w:jc w:val="left"/>
+            </w:pPr>
+            <w:r>
               <w:t xml:space="preserve">extra_trees</w:t>
             </w:r>
           </w:p>
@@ -6371,106 +6650,229 @@
               <w:jc w:val="left"/>
             </w:pPr>
             <w:r>
-              <w:t xml:space="preserve">0.60</w:t>
-            </w:r>
-          </w:p>
-        </w:tc>
-        <w:tc>
-          <w:p>
-            <w:pPr>
-              <w:pStyle w:val="Compact"/>
-              <w:jc w:val="left"/>
-            </w:pPr>
-            <w:r>
-              <w:t xml:space="preserve">0.36</w:t>
-            </w:r>
-          </w:p>
-        </w:tc>
-        <w:tc>
-          <w:p>
-            <w:pPr>
-              <w:pStyle w:val="Compact"/>
-              <w:jc w:val="left"/>
-            </w:pPr>
-            <w:r>
-              <w:t xml:space="preserve">-0.24</w:t>
-            </w:r>
-          </w:p>
-        </w:tc>
-        <w:tc>
-          <w:p>
-            <w:pPr>
-              <w:pStyle w:val="Compact"/>
-              <w:jc w:val="left"/>
-            </w:pPr>
-            <w:r>
-              <w:t xml:space="preserve">0.8148</w:t>
-            </w:r>
-          </w:p>
-        </w:tc>
-        <w:tc>
-          <w:p>
-            <w:pPr>
-              <w:pStyle w:val="Compact"/>
-              <w:jc w:val="left"/>
-            </w:pPr>
-            <w:r>
-              <w:t xml:space="preserve">0.8308</w:t>
-            </w:r>
-          </w:p>
-        </w:tc>
-        <w:tc>
-          <w:p>
-            <w:pPr>
-              <w:pStyle w:val="Compact"/>
-              <w:jc w:val="left"/>
-            </w:pPr>
-            <w:r>
-              <w:t xml:space="preserve">+47.50</w:t>
-            </w:r>
-          </w:p>
-        </w:tc>
-        <w:tc>
-          <w:p>
-            <w:pPr>
-              <w:pStyle w:val="Compact"/>
-              <w:jc w:val="left"/>
-            </w:pPr>
-            <w:r>
-              <w:t xml:space="preserve">5</w:t>
-            </w:r>
-          </w:p>
-        </w:tc>
-        <w:tc>
-          <w:p>
-            <w:pPr>
-              <w:pStyle w:val="Compact"/>
-              <w:jc w:val="left"/>
-            </w:pPr>
-            <w:r>
-              <w:t xml:space="preserve">15</w:t>
-            </w:r>
-          </w:p>
-        </w:tc>
-        <w:tc>
-          <w:p>
-            <w:pPr>
-              <w:pStyle w:val="Compact"/>
-              <w:jc w:val="left"/>
-            </w:pPr>
-            <w:r>
-              <w:t xml:space="preserve">17</w:t>
-            </w:r>
-          </w:p>
-        </w:tc>
-        <w:tc>
-          <w:p>
-            <w:pPr>
-              <w:pStyle w:val="Compact"/>
-              <w:jc w:val="left"/>
-            </w:pPr>
-            <w:r>
-              <w:t xml:space="preserve">5</w:t>
+              <w:t xml:space="preserve">+0.0021</w:t>
+            </w:r>
+          </w:p>
+        </w:tc>
+        <w:tc>
+          <w:p>
+            <w:pPr>
+              <w:pStyle w:val="Compact"/>
+              <w:jc w:val="left"/>
+            </w:pPr>
+            <w:r>
+              <w:t xml:space="preserve">25</w:t>
+            </w:r>
+          </w:p>
+        </w:tc>
+        <w:tc>
+          <w:p>
+            <w:pPr>
+              <w:pStyle w:val="Compact"/>
+              <w:jc w:val="left"/>
+            </w:pPr>
+            <w:r>
+              <w:t xml:space="preserve">+0.0020</w:t>
+            </w:r>
+          </w:p>
+        </w:tc>
+        <w:tc>
+          <w:p>
+            <w:pPr>
+              <w:pStyle w:val="Compact"/>
+              <w:jc w:val="left"/>
+            </w:pPr>
+            <w:r>
+              <w:t xml:space="preserve">[-0.0971, +0.1092]</w:t>
+            </w:r>
+          </w:p>
+        </w:tc>
+        <w:tc>
+          <w:p>
+            <w:pPr>
+              <w:pStyle w:val="Compact"/>
+              <w:jc w:val="left"/>
+            </w:pPr>
+            <w:r>
+              <w:t xml:space="preserve">0.9750</w:t>
+            </w:r>
+          </w:p>
+        </w:tc>
+        <w:tc>
+          <w:p>
+            <w:pPr>
+              <w:pStyle w:val="Compact"/>
+              <w:jc w:val="left"/>
+            </w:pPr>
+            <w:r>
+              <w:t xml:space="preserve">0.9750</w:t>
+            </w:r>
+          </w:p>
+        </w:tc>
+        <w:tc>
+          <w:p>
+            <w:pPr>
+              <w:pStyle w:val="Compact"/>
+              <w:jc w:val="left"/>
+            </w:pPr>
+            <w:r>
+              <w:t xml:space="preserve">0.9600</w:t>
+            </w:r>
+          </w:p>
+        </w:tc>
+        <w:tc>
+          <w:p>
+            <w:pPr>
+              <w:pStyle w:val="Compact"/>
+              <w:jc w:val="left"/>
+            </w:pPr>
+            <w:r>
+              <w:t xml:space="preserve">0</w:t>
+            </w:r>
+          </w:p>
+        </w:tc>
+        <w:tc>
+          <w:p>
+            <w:pPr>
+              <w:pStyle w:val="Compact"/>
+              <w:jc w:val="left"/>
+            </w:pPr>
+            <w:r>
+              <w:t xml:space="preserve">not_conclusive_after_holm</w:t>
+            </w:r>
+          </w:p>
+        </w:tc>
+      </w:tr>
+      <w:tr>
+        <w:tc>
+          <w:p>
+            <w:pPr>
+              <w:pStyle w:val="Compact"/>
+              <w:jc w:val="left"/>
+            </w:pPr>
+            <w:r>
+              <w:t xml:space="preserve">seattle</w:t>
+            </w:r>
+          </w:p>
+        </w:tc>
+        <w:tc>
+          <w:p>
+            <w:pPr>
+              <w:pStyle w:val="Compact"/>
+              <w:jc w:val="left"/>
+            </w:pPr>
+            <w:r>
+              <w:t xml:space="preserve">nola</w:t>
+            </w:r>
+          </w:p>
+        </w:tc>
+        <w:tc>
+          <w:p>
+            <w:pPr>
+              <w:pStyle w:val="Compact"/>
+              <w:jc w:val="left"/>
+            </w:pPr>
+            <w:r>
+              <w:t xml:space="preserve">extra_trees</w:t>
+            </w:r>
+          </w:p>
+        </w:tc>
+        <w:tc>
+          <w:p>
+            <w:pPr>
+              <w:pStyle w:val="Compact"/>
+              <w:jc w:val="left"/>
+            </w:pPr>
+            <w:r>
+              <w:t xml:space="preserve">+0.0488</w:t>
+            </w:r>
+          </w:p>
+        </w:tc>
+        <w:tc>
+          <w:p>
+            <w:pPr>
+              <w:pStyle w:val="Compact"/>
+              <w:jc w:val="left"/>
+            </w:pPr>
+            <w:r>
+              <w:t xml:space="preserve">25</w:t>
+            </w:r>
+          </w:p>
+        </w:tc>
+        <w:tc>
+          <w:p>
+            <w:pPr>
+              <w:pStyle w:val="Compact"/>
+              <w:jc w:val="left"/>
+            </w:pPr>
+            <w:r>
+              <w:t xml:space="preserve">+0.0488</w:t>
+            </w:r>
+          </w:p>
+        </w:tc>
+        <w:tc>
+          <w:p>
+            <w:pPr>
+              <w:pStyle w:val="Compact"/>
+              <w:jc w:val="left"/>
+            </w:pPr>
+            <w:r>
+              <w:t xml:space="preserve">[-0.0404, +0.1489]</w:t>
+            </w:r>
+          </w:p>
+        </w:tc>
+        <w:tc>
+          <w:p>
+            <w:pPr>
+              <w:pStyle w:val="Compact"/>
+              <w:jc w:val="left"/>
+            </w:pPr>
+            <w:r>
+              <w:t xml:space="preserve">0.3100</w:t>
+            </w:r>
+          </w:p>
+        </w:tc>
+        <w:tc>
+          <w:p>
+            <w:pPr>
+              <w:pStyle w:val="Compact"/>
+              <w:jc w:val="left"/>
+            </w:pPr>
+            <w:r>
+              <w:t xml:space="preserve">0.6200</w:t>
+            </w:r>
+          </w:p>
+        </w:tc>
+        <w:tc>
+          <w:p>
+            <w:pPr>
+              <w:pStyle w:val="Compact"/>
+              <w:jc w:val="left"/>
+            </w:pPr>
+            <w:r>
+              <w:t xml:space="preserve">1.0000</w:t>
+            </w:r>
+          </w:p>
+        </w:tc>
+        <w:tc>
+          <w:p>
+            <w:pPr>
+              <w:pStyle w:val="Compact"/>
+              <w:jc w:val="left"/>
+            </w:pPr>
+            <w:r>
+              <w:t xml:space="preserve">0</w:t>
+            </w:r>
+          </w:p>
+        </w:tc>
+        <w:tc>
+          <w:p>
+            <w:pPr>
+              <w:pStyle w:val="Compact"/>
+              <w:jc w:val="left"/>
+            </w:pPr>
+            <w:r>
+              <w:t xml:space="preserve">not_conclusive_after_holm</w:t>
             </w:r>
           </w:p>
         </w:tc>
@@ -6487,23 +6889,697 @@
         <w:t xml:space="preserve"> </w:t>
       </w:r>
       <w:r>
-        <w:t xml:space="preserve">- houston: governed=0.95 -&gt; utility-opt=0.05, cost_reduction=+46.43%, F1_delta=+0.0086</w:t>
+        <w:t xml:space="preserve">- houston-&gt;nola: median p=0.0000, Holm p=0.0000, direction_consistency=1.0000, sig_runs=25/25</w:t>
       </w:r>
       <w:r>
         <w:t xml:space="preserve"> </w:t>
       </w:r>
       <w:r>
-        <w:t xml:space="preserve">- nola: governed=0.35 -&gt; utility-opt=0.38, cost_reduction=+5.38%, F1_delta=+0.0235</w:t>
+        <w:t xml:space="preserve">- houston-&gt;seattle: median p=0.0000, Holm p=0.0000, direction_consistency=1.0000, sig_runs=25/25</w:t>
       </w:r>
       <w:r>
         <w:t xml:space="preserve"> </w:t>
       </w:r>
       <w:r>
-        <w:t xml:space="preserve">- seattle: governed=0.60 -&gt; utility-opt=0.36, cost_reduction=+47.50%, F1_delta=+0.0160</w:t>
+        <w:t xml:space="preserve">- nola-&gt;houston: median p=0.0000, Holm p=0.0000, direction_consistency=1.0000, sig_runs=25/25</w:t>
+      </w:r>
+      <w:r>
+        <w:t xml:space="preserve"> </w:t>
+      </w:r>
+      <w:r>
+        <w:t xml:space="preserve">- nola-&gt;seattle: median p=0.0000, Holm p=0.0000, direction_consistency=1.0000, sig_runs=25/25</w:t>
+      </w:r>
+      <w:r>
+        <w:t xml:space="preserve"> </w:t>
+      </w:r>
+      <w:r>
+        <w:t xml:space="preserve">- seattle-&gt;houston: median p=0.9750, Holm p=0.9750, direction_consistency=0.9600, sig_runs=0/25</w:t>
+      </w:r>
+      <w:r>
+        <w:t xml:space="preserve"> </w:t>
+      </w:r>
+      <w:r>
+        <w:t xml:space="preserve">- seattle-&gt;nola: median p=0.3100, Holm p=0.6200, direction_consistency=1.0000, sig_runs=0/25</w:t>
       </w:r>
     </w:p>
     <w:bookmarkEnd w:id="45"/>
+    <w:bookmarkStart w:id="46" w:name="X87628fc250d7b1867276627138d9078c8975729"/>
+    <w:p>
+      <w:pPr>
+        <w:pStyle w:val="Heading2"/>
+      </w:pPr>
+      <w:r>
+        <w:t xml:space="preserve">17. Threshold Utility Appendix (Operational Cost Profile)</w:t>
+      </w:r>
+    </w:p>
+    <w:p>
+      <w:pPr>
+        <w:numPr>
+          <w:ilvl w:val="0"/>
+          <w:numId w:val="1018"/>
+        </w:numPr>
+        <w:pStyle w:val="Compact"/>
+      </w:pPr>
+      <w:r>
+        <w:t xml:space="preserve">Utility-curve CSV:</w:t>
+      </w:r>
+      <w:r>
+        <w:t xml:space="preserve"> </w:t>
+      </w:r>
+      <w:r>
+        <w:rPr>
+          <w:rStyle w:val="VerbatimChar"/>
+        </w:rPr>
+        <w:t xml:space="preserve">threshold_utility_curve_summary.csv</w:t>
+      </w:r>
+    </w:p>
+    <w:p>
+      <w:pPr>
+        <w:numPr>
+          <w:ilvl w:val="0"/>
+          <w:numId w:val="1018"/>
+        </w:numPr>
+        <w:pStyle w:val="Compact"/>
+      </w:pPr>
+      <w:r>
+        <w:t xml:space="preserve">Operating-point CSV:</w:t>
+      </w:r>
+      <w:r>
+        <w:t xml:space="preserve"> </w:t>
+      </w:r>
+      <w:r>
+        <w:rPr>
+          <w:rStyle w:val="VerbatimChar"/>
+        </w:rPr>
+        <w:t xml:space="preserve">threshold_utility_operating_points.csv</w:t>
+      </w:r>
+    </w:p>
+    <w:p>
+      <w:pPr>
+        <w:numPr>
+          <w:ilvl w:val="0"/>
+          <w:numId w:val="1018"/>
+        </w:numPr>
+        <w:pStyle w:val="Compact"/>
+      </w:pPr>
+      <w:r>
+        <w:t xml:space="preserve">Utility appendix document:</w:t>
+      </w:r>
+      <w:r>
+        <w:t xml:space="preserve"> </w:t>
+      </w:r>
+      <w:r>
+        <w:rPr>
+          <w:rStyle w:val="VerbatimChar"/>
+        </w:rPr>
+        <w:t xml:space="preserve">threshold_utility_appendix_v0.2_2026-04-09.md</w:t>
+      </w:r>
+    </w:p>
+    <w:tbl>
+      <w:tblPr>
+        <w:tblStyle w:val="Table"/>
+        <w:tblW w:type="pct" w:w="5000.0"/>
+        <w:tblLook w:firstRow="1" w:lastRow="0" w:firstColumn="0" w:lastColumn="0" w:noHBand="0" w:noVBand="0" w:val="0020"/>
+      </w:tblPr>
+      <w:tblGrid>
+        <w:gridCol w:w="660"/>
+        <w:gridCol w:w="660"/>
+        <w:gridCol w:w="660"/>
+        <w:gridCol w:w="660"/>
+        <w:gridCol w:w="660"/>
+        <w:gridCol w:w="660"/>
+        <w:gridCol w:w="660"/>
+        <w:gridCol w:w="660"/>
+        <w:gridCol w:w="660"/>
+        <w:gridCol w:w="660"/>
+        <w:gridCol w:w="660"/>
+        <w:gridCol w:w="660"/>
+      </w:tblGrid>
+      <w:tr>
+        <w:tc>
+          <w:p>
+            <w:pPr>
+              <w:pStyle w:val="Compact"/>
+              <w:jc w:val="left"/>
+            </w:pPr>
+            <w:r>
+              <w:t xml:space="preserve">region</w:t>
+            </w:r>
+          </w:p>
+        </w:tc>
+        <w:tc>
+          <w:p>
+            <w:pPr>
+              <w:pStyle w:val="Compact"/>
+              <w:jc w:val="left"/>
+            </w:pPr>
+            <w:r>
+              <w:t xml:space="preserve">model_name</w:t>
+            </w:r>
+          </w:p>
+        </w:tc>
+        <w:tc>
+          <w:p>
+            <w:pPr>
+              <w:pStyle w:val="Compact"/>
+              <w:jc w:val="left"/>
+            </w:pPr>
+            <w:r>
+              <w:t xml:space="preserve">governed_threshold</w:t>
+            </w:r>
+          </w:p>
+        </w:tc>
+        <w:tc>
+          <w:p>
+            <w:pPr>
+              <w:pStyle w:val="Compact"/>
+              <w:jc w:val="left"/>
+            </w:pPr>
+            <w:r>
+              <w:t xml:space="preserve">utility_opt_threshold</w:t>
+            </w:r>
+          </w:p>
+        </w:tc>
+        <w:tc>
+          <w:p>
+            <w:pPr>
+              <w:pStyle w:val="Compact"/>
+              <w:jc w:val="left"/>
+            </w:pPr>
+            <w:r>
+              <w:t xml:space="preserve">threshold_shift</w:t>
+            </w:r>
+          </w:p>
+        </w:tc>
+        <w:tc>
+          <w:p>
+            <w:pPr>
+              <w:pStyle w:val="Compact"/>
+              <w:jc w:val="left"/>
+            </w:pPr>
+            <w:r>
+              <w:t xml:space="preserve">governed_f1</w:t>
+            </w:r>
+          </w:p>
+        </w:tc>
+        <w:tc>
+          <w:p>
+            <w:pPr>
+              <w:pStyle w:val="Compact"/>
+              <w:jc w:val="left"/>
+            </w:pPr>
+            <w:r>
+              <w:t xml:space="preserve">opt_f1</w:t>
+            </w:r>
+          </w:p>
+        </w:tc>
+        <w:tc>
+          <w:p>
+            <w:pPr>
+              <w:pStyle w:val="Compact"/>
+              <w:jc w:val="left"/>
+            </w:pPr>
+            <w:r>
+              <w:t xml:space="preserve">cost_reduction_pct</w:t>
+            </w:r>
+          </w:p>
+        </w:tc>
+        <w:tc>
+          <w:p>
+            <w:pPr>
+              <w:pStyle w:val="Compact"/>
+              <w:jc w:val="left"/>
+            </w:pPr>
+            <w:r>
+              <w:t xml:space="preserve">governed_fp</w:t>
+            </w:r>
+          </w:p>
+        </w:tc>
+        <w:tc>
+          <w:p>
+            <w:pPr>
+              <w:pStyle w:val="Compact"/>
+              <w:jc w:val="left"/>
+            </w:pPr>
+            <w:r>
+              <w:t xml:space="preserve">governed_fn</w:t>
+            </w:r>
+          </w:p>
+        </w:tc>
+        <w:tc>
+          <w:p>
+            <w:pPr>
+              <w:pStyle w:val="Compact"/>
+              <w:jc w:val="left"/>
+            </w:pPr>
+            <w:r>
+              <w:t xml:space="preserve">opt_fp</w:t>
+            </w:r>
+          </w:p>
+        </w:tc>
+        <w:tc>
+          <w:p>
+            <w:pPr>
+              <w:pStyle w:val="Compact"/>
+              <w:jc w:val="left"/>
+            </w:pPr>
+            <w:r>
+              <w:t xml:space="preserve">opt_fn</w:t>
+            </w:r>
+          </w:p>
+        </w:tc>
+      </w:tr>
+      <w:tr>
+        <w:tc>
+          <w:p>
+            <w:pPr>
+              <w:pStyle w:val="Compact"/>
+              <w:jc w:val="left"/>
+            </w:pPr>
+            <w:r>
+              <w:t xml:space="preserve">houston</w:t>
+            </w:r>
+          </w:p>
+        </w:tc>
+        <w:tc>
+          <w:p>
+            <w:pPr>
+              <w:pStyle w:val="Compact"/>
+              <w:jc w:val="left"/>
+            </w:pPr>
+            <w:r>
+              <w:t xml:space="preserve">hgbt</w:t>
+            </w:r>
+          </w:p>
+        </w:tc>
+        <w:tc>
+          <w:p>
+            <w:pPr>
+              <w:pStyle w:val="Compact"/>
+              <w:jc w:val="left"/>
+            </w:pPr>
+            <w:r>
+              <w:t xml:space="preserve">0.95</w:t>
+            </w:r>
+          </w:p>
+        </w:tc>
+        <w:tc>
+          <w:p>
+            <w:pPr>
+              <w:pStyle w:val="Compact"/>
+              <w:jc w:val="left"/>
+            </w:pPr>
+            <w:r>
+              <w:t xml:space="preserve">0.05</w:t>
+            </w:r>
+          </w:p>
+        </w:tc>
+        <w:tc>
+          <w:p>
+            <w:pPr>
+              <w:pStyle w:val="Compact"/>
+              <w:jc w:val="left"/>
+            </w:pPr>
+            <w:r>
+              <w:t xml:space="preserve">-0.90</w:t>
+            </w:r>
+          </w:p>
+        </w:tc>
+        <w:tc>
+          <w:p>
+            <w:pPr>
+              <w:pStyle w:val="Compact"/>
+              <w:jc w:val="left"/>
+            </w:pPr>
+            <w:r>
+              <w:t xml:space="preserve">0.8286</w:t>
+            </w:r>
+          </w:p>
+        </w:tc>
+        <w:tc>
+          <w:p>
+            <w:pPr>
+              <w:pStyle w:val="Compact"/>
+              <w:jc w:val="left"/>
+            </w:pPr>
+            <w:r>
+              <w:t xml:space="preserve">0.8372</w:t>
+            </w:r>
+          </w:p>
+        </w:tc>
+        <w:tc>
+          <w:p>
+            <w:pPr>
+              <w:pStyle w:val="Compact"/>
+              <w:jc w:val="left"/>
+            </w:pPr>
+            <w:r>
+              <w:t xml:space="preserve">+46.43</w:t>
+            </w:r>
+          </w:p>
+        </w:tc>
+        <w:tc>
+          <w:p>
+            <w:pPr>
+              <w:pStyle w:val="Compact"/>
+              <w:jc w:val="left"/>
+            </w:pPr>
+            <w:r>
+              <w:t xml:space="preserve">1</w:t>
+            </w:r>
+          </w:p>
+        </w:tc>
+        <w:tc>
+          <w:p>
+            <w:pPr>
+              <w:pStyle w:val="Compact"/>
+              <w:jc w:val="left"/>
+            </w:pPr>
+            <w:r>
+              <w:t xml:space="preserve">11</w:t>
+            </w:r>
+          </w:p>
+        </w:tc>
+        <w:tc>
+          <w:p>
+            <w:pPr>
+              <w:pStyle w:val="Compact"/>
+              <w:jc w:val="left"/>
+            </w:pPr>
+            <w:r>
+              <w:t xml:space="preserve">10</w:t>
+            </w:r>
+          </w:p>
+        </w:tc>
+        <w:tc>
+          <w:p>
+            <w:pPr>
+              <w:pStyle w:val="Compact"/>
+              <w:jc w:val="left"/>
+            </w:pPr>
+            <w:r>
+              <w:t xml:space="preserve">4</w:t>
+            </w:r>
+          </w:p>
+        </w:tc>
+      </w:tr>
+      <w:tr>
+        <w:tc>
+          <w:p>
+            <w:pPr>
+              <w:pStyle w:val="Compact"/>
+              <w:jc w:val="left"/>
+            </w:pPr>
+            <w:r>
+              <w:t xml:space="preserve">nola</w:t>
+            </w:r>
+          </w:p>
+        </w:tc>
+        <w:tc>
+          <w:p>
+            <w:pPr>
+              <w:pStyle w:val="Compact"/>
+              <w:jc w:val="left"/>
+            </w:pPr>
+            <w:r>
+              <w:t xml:space="preserve">hgbt</w:t>
+            </w:r>
+          </w:p>
+        </w:tc>
+        <w:tc>
+          <w:p>
+            <w:pPr>
+              <w:pStyle w:val="Compact"/>
+              <w:jc w:val="left"/>
+            </w:pPr>
+            <w:r>
+              <w:t xml:space="preserve">0.35</w:t>
+            </w:r>
+          </w:p>
+        </w:tc>
+        <w:tc>
+          <w:p>
+            <w:pPr>
+              <w:pStyle w:val="Compact"/>
+              <w:jc w:val="left"/>
+            </w:pPr>
+            <w:r>
+              <w:t xml:space="preserve">0.38</w:t>
+            </w:r>
+          </w:p>
+        </w:tc>
+        <w:tc>
+          <w:p>
+            <w:pPr>
+              <w:pStyle w:val="Compact"/>
+              <w:jc w:val="left"/>
+            </w:pPr>
+            <w:r>
+              <w:t xml:space="preserve">+0.03</w:t>
+            </w:r>
+          </w:p>
+        </w:tc>
+        <w:tc>
+          <w:p>
+            <w:pPr>
+              <w:pStyle w:val="Compact"/>
+              <w:jc w:val="left"/>
+            </w:pPr>
+            <w:r>
+              <w:t xml:space="preserve">0.6015</w:t>
+            </w:r>
+          </w:p>
+        </w:tc>
+        <w:tc>
+          <w:p>
+            <w:pPr>
+              <w:pStyle w:val="Compact"/>
+              <w:jc w:val="left"/>
+            </w:pPr>
+            <w:r>
+              <w:t xml:space="preserve">0.6250</w:t>
+            </w:r>
+          </w:p>
+        </w:tc>
+        <w:tc>
+          <w:p>
+            <w:pPr>
+              <w:pStyle w:val="Compact"/>
+              <w:jc w:val="left"/>
+            </w:pPr>
+            <w:r>
+              <w:t xml:space="preserve">+5.38</w:t>
+            </w:r>
+          </w:p>
+        </w:tc>
+        <w:tc>
+          <w:p>
+            <w:pPr>
+              <w:pStyle w:val="Compact"/>
+              <w:jc w:val="left"/>
+            </w:pPr>
+            <w:r>
+              <w:t xml:space="preserve">43</w:t>
+            </w:r>
+          </w:p>
+        </w:tc>
+        <w:tc>
+          <w:p>
+            <w:pPr>
+              <w:pStyle w:val="Compact"/>
+              <w:jc w:val="left"/>
+            </w:pPr>
+            <w:r>
+              <w:t xml:space="preserve">10</w:t>
+            </w:r>
+          </w:p>
+        </w:tc>
+        <w:tc>
+          <w:p>
+            <w:pPr>
+              <w:pStyle w:val="Compact"/>
+              <w:jc w:val="left"/>
+            </w:pPr>
+            <w:r>
+              <w:t xml:space="preserve">38</w:t>
+            </w:r>
+          </w:p>
+        </w:tc>
+        <w:tc>
+          <w:p>
+            <w:pPr>
+              <w:pStyle w:val="Compact"/>
+              <w:jc w:val="left"/>
+            </w:pPr>
+            <w:r>
+              <w:t xml:space="preserve">10</w:t>
+            </w:r>
+          </w:p>
+        </w:tc>
+      </w:tr>
+      <w:tr>
+        <w:tc>
+          <w:p>
+            <w:pPr>
+              <w:pStyle w:val="Compact"/>
+              <w:jc w:val="left"/>
+            </w:pPr>
+            <w:r>
+              <w:t xml:space="preserve">seattle</w:t>
+            </w:r>
+          </w:p>
+        </w:tc>
+        <w:tc>
+          <w:p>
+            <w:pPr>
+              <w:pStyle w:val="Compact"/>
+              <w:jc w:val="left"/>
+            </w:pPr>
+            <w:r>
+              <w:t xml:space="preserve">extra_trees</w:t>
+            </w:r>
+          </w:p>
+        </w:tc>
+        <w:tc>
+          <w:p>
+            <w:pPr>
+              <w:pStyle w:val="Compact"/>
+              <w:jc w:val="left"/>
+            </w:pPr>
+            <w:r>
+              <w:t xml:space="preserve">0.60</w:t>
+            </w:r>
+          </w:p>
+        </w:tc>
+        <w:tc>
+          <w:p>
+            <w:pPr>
+              <w:pStyle w:val="Compact"/>
+              <w:jc w:val="left"/>
+            </w:pPr>
+            <w:r>
+              <w:t xml:space="preserve">0.36</w:t>
+            </w:r>
+          </w:p>
+        </w:tc>
+        <w:tc>
+          <w:p>
+            <w:pPr>
+              <w:pStyle w:val="Compact"/>
+              <w:jc w:val="left"/>
+            </w:pPr>
+            <w:r>
+              <w:t xml:space="preserve">-0.24</w:t>
+            </w:r>
+          </w:p>
+        </w:tc>
+        <w:tc>
+          <w:p>
+            <w:pPr>
+              <w:pStyle w:val="Compact"/>
+              <w:jc w:val="left"/>
+            </w:pPr>
+            <w:r>
+              <w:t xml:space="preserve">0.8148</w:t>
+            </w:r>
+          </w:p>
+        </w:tc>
+        <w:tc>
+          <w:p>
+            <w:pPr>
+              <w:pStyle w:val="Compact"/>
+              <w:jc w:val="left"/>
+            </w:pPr>
+            <w:r>
+              <w:t xml:space="preserve">0.8308</w:t>
+            </w:r>
+          </w:p>
+        </w:tc>
+        <w:tc>
+          <w:p>
+            <w:pPr>
+              <w:pStyle w:val="Compact"/>
+              <w:jc w:val="left"/>
+            </w:pPr>
+            <w:r>
+              <w:t xml:space="preserve">+47.50</w:t>
+            </w:r>
+          </w:p>
+        </w:tc>
+        <w:tc>
+          <w:p>
+            <w:pPr>
+              <w:pStyle w:val="Compact"/>
+              <w:jc w:val="left"/>
+            </w:pPr>
+            <w:r>
+              <w:t xml:space="preserve">5</w:t>
+            </w:r>
+          </w:p>
+        </w:tc>
+        <w:tc>
+          <w:p>
+            <w:pPr>
+              <w:pStyle w:val="Compact"/>
+              <w:jc w:val="left"/>
+            </w:pPr>
+            <w:r>
+              <w:t xml:space="preserve">15</w:t>
+            </w:r>
+          </w:p>
+        </w:tc>
+        <w:tc>
+          <w:p>
+            <w:pPr>
+              <w:pStyle w:val="Compact"/>
+              <w:jc w:val="left"/>
+            </w:pPr>
+            <w:r>
+              <w:t xml:space="preserve">17</w:t>
+            </w:r>
+          </w:p>
+        </w:tc>
+        <w:tc>
+          <w:p>
+            <w:pPr>
+              <w:pStyle w:val="Compact"/>
+              <w:jc w:val="left"/>
+            </w:pPr>
+            <w:r>
+              <w:t xml:space="preserve">5</w:t>
+            </w:r>
+          </w:p>
+        </w:tc>
+      </w:tr>
+    </w:tbl>
+    <w:p>
+      <w:pPr>
+        <w:pStyle w:val="BodyText"/>
+      </w:pPr>
+      <w:r>
+        <w:t xml:space="preserve">Key interpretation:</w:t>
+      </w:r>
+      <w:r>
+        <w:t xml:space="preserve"> </w:t>
+      </w:r>
+      <w:r>
+        <w:t xml:space="preserve">- houston: governed=0.95 -&gt; utility-opt=0.05, cost_reduction=+46.43%, F1_delta=+0.0086</w:t>
+      </w:r>
+      <w:r>
+        <w:t xml:space="preserve"> </w:t>
+      </w:r>
+      <w:r>
+        <w:t xml:space="preserve">- nola: governed=0.35 -&gt; utility-opt=0.38, cost_reduction=+5.38%, F1_delta=+0.0235</w:t>
+      </w:r>
+      <w:r>
+        <w:t xml:space="preserve"> </w:t>
+      </w:r>
+      <w:r>
+        <w:t xml:space="preserve">- seattle: governed=0.60 -&gt; utility-opt=0.36, cost_reduction=+47.50%, F1_delta=+0.0160</w:t>
+      </w:r>
+    </w:p>
     <w:bookmarkEnd w:id="46"/>
+    <w:bookmarkEnd w:id="47"/>
     <w:sectPr/>
   </w:body>
 </w:document>
@@ -6738,6 +7814,9 @@
     <w:abstractNumId w:val="991"/>
   </w:num>
   <w:num w:numId="1017">
+    <w:abstractNumId w:val="991"/>
+  </w:num>
+  <w:num w:numId="1018">
     <w:abstractNumId w:val="991"/>
   </w:num>
 </w:numbering>

</xml_diff>

<commit_message>
Close remaining examiner gaps in manuscript pack
</commit_message>
<xml_diff>
--- a/docs/manuscript/v0.2_2026-04-09/manuscript_draft_v0.2_2026-04-09_en.docx
+++ b/docs/manuscript/v0.2_2026-04-09/manuscript_draft_v0.2_2026-04-09_en.docx
@@ -2,7 +2,7 @@
 <file path=word/document.xml><?xml version="1.0" encoding="utf-8"?>
 <w:document xmlns:w="http://schemas.openxmlformats.org/wordprocessingml/2006/main" xmlns:m="http://schemas.openxmlformats.org/officeDocument/2006/math" xmlns:r="http://schemas.openxmlformats.org/officeDocument/2006/relationships" xmlns:o="urn:schemas-microsoft-com:office:office" xmlns:v="urn:schemas-microsoft-com:vml" xmlns:w10="urn:schemas-microsoft-com:office:word" xmlns:a="http://schemas.openxmlformats.org/drawingml/2006/main" xmlns:pic="http://schemas.openxmlformats.org/drawingml/2006/picture" xmlns:wp="http://schemas.openxmlformats.org/drawingml/2006/wordprocessingDrawing">
   <w:body>
-    <w:bookmarkStart w:id="47" w:name="X9cf75eb6c88c04ea3d3656b65c138eab314f5a4"/>
+    <w:bookmarkStart w:id="49" w:name="X9cf75eb6c88c04ea3d3656b65c138eab314f5a4"/>
     <w:p>
       <w:pPr>
         <w:pStyle w:val="Heading1"/>
@@ -29,7 +29,7 @@
       </w:r>
     </w:p>
     <w:bookmarkEnd w:id="20"/>
-    <w:bookmarkStart w:id="24" w:name="X5d1c2e49801f299774678c7b6515d0b9eecf2c9"/>
+    <w:bookmarkStart w:id="25" w:name="X5d1c2e49801f299774678c7b6515d0b9eecf2c9"/>
     <w:p>
       <w:pPr>
         <w:pStyle w:val="Heading2"/>
@@ -356,8 +356,138 @@
       </w:r>
     </w:p>
     <w:bookmarkEnd w:id="23"/>
+    <w:bookmarkStart w:id="24" w:name="X25888f681a01cd63ea71945f22264d361714f42"/>
+    <w:p>
+      <w:pPr>
+        <w:pStyle w:val="Heading3"/>
+      </w:pPr>
+      <w:r>
+        <w:t xml:space="preserve">2.4 Label-Generation Policy (Near-Miss Proxy Grounding)</w:t>
+      </w:r>
+    </w:p>
+    <w:p>
+      <w:pPr>
+        <w:numPr>
+          <w:ilvl w:val="0"/>
+          <w:numId w:val="1005"/>
+        </w:numPr>
+        <w:pStyle w:val="Compact"/>
+      </w:pPr>
+      <w:r>
+        <w:t xml:space="preserve">Deterministic label rule:</w:t>
+      </w:r>
+      <w:r>
+        <w:t xml:space="preserve"> </w:t>
+      </w:r>
+      <w:r>
+        <w:rPr>
+          <w:rStyle w:val="VerbatimChar"/>
+        </w:rPr>
+        <w:t xml:space="preserve">label_future_conflict = 1</w:t>
+      </w:r>
+      <w:r>
+        <w:t xml:space="preserve"> </w:t>
+      </w:r>
+      <w:r>
+        <w:t xml:space="preserve">iff</w:t>
+      </w:r>
+      <w:r>
+        <w:t xml:space="preserve"> </w:t>
+      </w:r>
+      <w:r>
+        <w:rPr>
+          <w:rStyle w:val="VerbatimChar"/>
+        </w:rPr>
+        <w:t xml:space="preserve">future_min_distance_nm &lt;= label_distance_nm</w:t>
+      </w:r>
+      <w:r>
+        <w:t xml:space="preserve">.</w:t>
+      </w:r>
+    </w:p>
+    <w:p>
+      <w:pPr>
+        <w:numPr>
+          <w:ilvl w:val="0"/>
+          <w:numId w:val="1005"/>
+        </w:numPr>
+        <w:pStyle w:val="Compact"/>
+      </w:pPr>
+      <w:r>
+        <w:t xml:space="preserve">Default configuration:</w:t>
+      </w:r>
+      <w:r>
+        <w:t xml:space="preserve"> </w:t>
+      </w:r>
+      <w:r>
+        <w:rPr>
+          <w:rStyle w:val="VerbatimChar"/>
+        </w:rPr>
+        <w:t xml:space="preserve">label_distance_nm=0.5 NM</w:t>
+      </w:r>
+      <w:r>
+        <w:t xml:space="preserve">,</w:t>
+      </w:r>
+      <w:r>
+        <w:t xml:space="preserve"> </w:t>
+      </w:r>
+      <w:r>
+        <w:rPr>
+          <w:rStyle w:val="VerbatimChar"/>
+        </w:rPr>
+        <w:t xml:space="preserve">horizon=15 minutes</w:t>
+      </w:r>
+      <w:r>
+        <w:t xml:space="preserve">, and</w:t>
+      </w:r>
+      <w:r>
+        <w:t xml:space="preserve"> </w:t>
+      </w:r>
+      <w:r>
+        <w:rPr>
+          <w:rStyle w:val="VerbatimChar"/>
+        </w:rPr>
+        <w:t xml:space="preserve">future_points_used &gt;= 2</w:t>
+      </w:r>
+      <w:r>
+        <w:t xml:space="preserve">.</w:t>
+      </w:r>
+    </w:p>
+    <w:p>
+      <w:pPr>
+        <w:numPr>
+          <w:ilvl w:val="0"/>
+          <w:numId w:val="1005"/>
+        </w:numPr>
+        <w:pStyle w:val="Compact"/>
+      </w:pPr>
+      <w:r>
+        <w:t xml:space="preserve">The learning target is therefore a reconstructed-trajectory near-miss proxy, not an actual collision ground truth (</w:t>
+      </w:r>
+      <w:r>
+        <w:rPr>
+          <w:rStyle w:val="VerbatimChar"/>
+        </w:rPr>
+        <w:t xml:space="preserve">RW-03</w:t>
+      </w:r>
+      <w:r>
+        <w:t xml:space="preserve">).</w:t>
+      </w:r>
+    </w:p>
+    <w:p>
+      <w:pPr>
+        <w:numPr>
+          <w:ilvl w:val="0"/>
+          <w:numId w:val="1005"/>
+        </w:numPr>
+        <w:pStyle w:val="Compact"/>
+      </w:pPr>
+      <w:r>
+        <w:t xml:space="preserve">Operational interpretation: this label supports early-warning prioritization, not legal collision adjudication.</w:t>
+      </w:r>
+    </w:p>
     <w:bookmarkEnd w:id="24"/>
-    <w:bookmarkStart w:id="26" w:name="final-model-selection-10-seed"/>
+    <w:bookmarkEnd w:id="25"/>
+    <w:bookmarkStart w:id="27" w:name="final-model-selection-10-seed"/>
     <w:p>
       <w:pPr>
         <w:pStyle w:val="Heading2"/>
@@ -736,7 +866,7 @@
         <w:t xml:space="preserve">is selected for Seattle.</w:t>
       </w:r>
     </w:p>
-    <w:bookmarkStart w:id="25" w:name="uncertainty-95-ci"/>
+    <w:bookmarkStart w:id="26" w:name="uncertainty-95-ci"/>
     <w:p>
       <w:pPr>
         <w:pStyle w:val="Heading3"/>
@@ -1216,7 +1346,7 @@
       <w:pPr>
         <w:numPr>
           <w:ilvl w:val="0"/>
-          <w:numId w:val="1005"/>
+          <w:numId w:val="1006"/>
         </w:numPr>
         <w:pStyle w:val="Compact"/>
       </w:pPr>
@@ -1254,9 +1384,9 @@
         <w:t xml:space="preserve">assumption.</w:t>
       </w:r>
     </w:p>
-    <w:bookmarkEnd w:id="25"/>
     <w:bookmarkEnd w:id="26"/>
-    <w:bookmarkStart w:id="29" w:name="core-transfer-performance"/>
+    <w:bookmarkEnd w:id="27"/>
+    <w:bookmarkStart w:id="30" w:name="core-transfer-performance"/>
     <w:p>
       <w:pPr>
         <w:pStyle w:val="Heading2"/>
@@ -1764,7 +1894,7 @@
         <w:t xml:space="preserve">Interpretation: Houston as source shows negative ΔF1 (domain-shift stress), while NOLA/Seattle sources show positive or near-neutral transfer outcomes.</w:t>
       </w:r>
     </w:p>
-    <w:bookmarkStart w:id="27" w:name="transfer-uncertainty-bootstrap-95-ci"/>
+    <w:bookmarkStart w:id="28" w:name="transfer-uncertainty-bootstrap-95-ci"/>
     <w:p>
       <w:pPr>
         <w:pStyle w:val="Heading3"/>
@@ -2346,34 +2476,12 @@
       <w:pPr>
         <w:numPr>
           <w:ilvl w:val="0"/>
-          <w:numId w:val="1006"/>
+          <w:numId w:val="1007"/>
         </w:numPr>
         <w:pStyle w:val="Compact"/>
       </w:pPr>
       <w:r>
         <w:t xml:space="preserve">Note: transfer CIs are bootstrap estimates from source/target prediction CSVs.</w:t>
-      </w:r>
-    </w:p>
-    <w:p>
-      <w:pPr>
-        <w:numPr>
-          <w:ilvl w:val="0"/>
-          <w:numId w:val="1006"/>
-        </w:numPr>
-        <w:pStyle w:val="Compact"/>
-      </w:pPr>
-      <w:r>
-        <w:t xml:space="preserve">Additional caution (high-uncertainty routes): No high-uncertainty transfer route detected.</w:t>
-      </w:r>
-    </w:p>
-    <w:bookmarkEnd w:id="27"/>
-    <w:bookmarkStart w:id="28" w:name="X5648d77f271f43fcab324fc7dc4a2c9131e2294"/>
-    <w:p>
-      <w:pPr>
-        <w:pStyle w:val="Heading3"/>
-      </w:pPr>
-      <w:r>
-        <w:t xml:space="preserve">4.2 Out-of-Domain Validation Expansion (Additional Area/Year Transfer)</w:t>
       </w:r>
     </w:p>
     <w:p>
@@ -2385,6 +2493,28 @@
         <w:pStyle w:val="Compact"/>
       </w:pPr>
       <w:r>
+        <w:t xml:space="preserve">Additional caution (high-uncertainty routes): No high-uncertainty transfer route detected.</w:t>
+      </w:r>
+    </w:p>
+    <w:bookmarkEnd w:id="28"/>
+    <w:bookmarkStart w:id="29" w:name="X5648d77f271f43fcab324fc7dc4a2c9131e2294"/>
+    <w:p>
+      <w:pPr>
+        <w:pStyle w:val="Heading3"/>
+      </w:pPr>
+      <w:r>
+        <w:t xml:space="preserve">4.2 Out-of-Domain Validation Expansion (Additional Area/Year Transfer)</w:t>
+      </w:r>
+    </w:p>
+    <w:p>
+      <w:pPr>
+        <w:numPr>
+          <w:ilvl w:val="0"/>
+          <w:numId w:val="1008"/>
+        </w:numPr>
+        <w:pStyle w:val="Compact"/>
+      </w:pPr>
+      <w:r>
         <w:t xml:space="preserve">Detail CSV:</w:t>
       </w:r>
       <w:r>
@@ -2401,7 +2531,7 @@
       <w:pPr>
         <w:numPr>
           <w:ilvl w:val="0"/>
-          <w:numId w:val="1007"/>
+          <w:numId w:val="1008"/>
         </w:numPr>
         <w:pStyle w:val="Compact"/>
       </w:pPr>
@@ -2917,9 +3047,9 @@
         <w:t xml:space="preserve">- Source-summary cross-check: true_area_row_count=8, transfer_row_count=6, true_area_low_support_count=0</w:t>
       </w:r>
     </w:p>
-    <w:bookmarkEnd w:id="28"/>
     <w:bookmarkEnd w:id="29"/>
-    <w:bookmarkStart w:id="30" w:name="ablation-tabular-vs-raster-cnn"/>
+    <w:bookmarkEnd w:id="30"/>
+    <w:bookmarkStart w:id="31" w:name="ablation-tabular-vs-raster-cnn"/>
     <w:p>
       <w:pPr>
         <w:pStyle w:val="Heading2"/>
@@ -3421,8 +3551,8 @@
         <w:t xml:space="preserve">- seattle: ΔF1(tabular-cnn)=-0.0149 (raster-CNN is higher), ΔECE(tabular-cnn)=-0.2310 (tabular shows better calibration).</w:t>
       </w:r>
     </w:p>
-    <w:bookmarkEnd w:id="30"/>
-    <w:bookmarkStart w:id="35" w:name="figure-set"/>
+    <w:bookmarkEnd w:id="31"/>
+    <w:bookmarkStart w:id="36" w:name="figure-set"/>
     <w:p>
       <w:pPr>
         <w:pStyle w:val="Heading2"/>
@@ -3435,7 +3565,7 @@
       <w:pPr>
         <w:numPr>
           <w:ilvl w:val="0"/>
-          <w:numId w:val="1008"/>
+          <w:numId w:val="1009"/>
         </w:numPr>
         <w:pStyle w:val="Compact"/>
       </w:pPr>
@@ -3461,7 +3591,7 @@
                     </pic:cNvPicPr>
                   </pic:nvPicPr>
                   <pic:blipFill>
-                    <a:blip r:embed="rId31"/>
+                    <a:blip r:embed="rId32"/>
                     <a:stretch>
                       <a:fillRect/>
                     </a:stretch>
@@ -3492,7 +3622,7 @@
       <w:pPr>
         <w:numPr>
           <w:ilvl w:val="0"/>
-          <w:numId w:val="1008"/>
+          <w:numId w:val="1009"/>
         </w:numPr>
         <w:pStyle w:val="Compact"/>
       </w:pPr>
@@ -3518,7 +3648,7 @@
                     </pic:cNvPicPr>
                   </pic:nvPicPr>
                   <pic:blipFill>
-                    <a:blip r:embed="rId32"/>
+                    <a:blip r:embed="rId33"/>
                     <a:stretch>
                       <a:fillRect/>
                     </a:stretch>
@@ -3549,7 +3679,7 @@
       <w:pPr>
         <w:numPr>
           <w:ilvl w:val="0"/>
-          <w:numId w:val="1008"/>
+          <w:numId w:val="1009"/>
         </w:numPr>
         <w:pStyle w:val="Compact"/>
       </w:pPr>
@@ -3575,7 +3705,7 @@
                     </pic:cNvPicPr>
                   </pic:nvPicPr>
                   <pic:blipFill>
-                    <a:blip r:embed="rId33"/>
+                    <a:blip r:embed="rId34"/>
                     <a:stretch>
                       <a:fillRect/>
                     </a:stretch>
@@ -3606,7 +3736,7 @@
       <w:pPr>
         <w:numPr>
           <w:ilvl w:val="0"/>
-          <w:numId w:val="1008"/>
+          <w:numId w:val="1009"/>
         </w:numPr>
         <w:pStyle w:val="Compact"/>
       </w:pPr>
@@ -3632,7 +3762,7 @@
                     </pic:cNvPicPr>
                   </pic:nvPicPr>
                   <pic:blipFill>
-                    <a:blip r:embed="rId34"/>
+                    <a:blip r:embed="rId35"/>
                     <a:stretch>
                       <a:fillRect/>
                     </a:stretch>
@@ -3659,8 +3789,8 @@
         </w:drawing>
       </w:r>
     </w:p>
-    <w:bookmarkEnd w:id="35"/>
-    <w:bookmarkStart w:id="36" w:name="terminology-mapping-koreng"/>
+    <w:bookmarkEnd w:id="36"/>
+    <w:bookmarkStart w:id="37" w:name="terminology-mapping-koreng"/>
     <w:p>
       <w:pPr>
         <w:pStyle w:val="Heading2"/>
@@ -4216,45 +4346,14 @@
         <w:t xml:space="preserve">.</w:t>
       </w:r>
     </w:p>
-    <w:bookmarkEnd w:id="36"/>
-    <w:bookmarkStart w:id="37" w:name="bilingual-figure-captions"/>
+    <w:bookmarkEnd w:id="37"/>
+    <w:bookmarkStart w:id="38" w:name="bilingual-figure-captions"/>
     <w:p>
       <w:pPr>
         <w:pStyle w:val="Heading2"/>
       </w:pPr>
       <w:r>
         <w:t xml:space="preserve">8. Bilingual Figure Captions</w:t>
-      </w:r>
-    </w:p>
-    <w:p>
-      <w:pPr>
-        <w:numPr>
-          <w:ilvl w:val="0"/>
-          <w:numId w:val="1009"/>
-        </w:numPr>
-        <w:pStyle w:val="Compact"/>
-      </w:pPr>
-      <w:r>
-        <w:t xml:space="preserve">KOR/ENG caption set:</w:t>
-      </w:r>
-      <w:r>
-        <w:t xml:space="preserve"> </w:t>
-      </w:r>
-      <w:r>
-        <w:rPr>
-          <w:rStyle w:val="VerbatimChar"/>
-        </w:rPr>
-        <w:t xml:space="preserve">figure_captions_bilingual_v0.2_2026-04-09.md</w:t>
-      </w:r>
-    </w:p>
-    <w:bookmarkEnd w:id="37"/>
-    <w:bookmarkStart w:id="38" w:name="scenario-visualization-evidence"/>
-    <w:p>
-      <w:pPr>
-        <w:pStyle w:val="Heading2"/>
-      </w:pPr>
-      <w:r>
-        <w:t xml:space="preserve">9. Scenario Visualization Evidence</w:t>
       </w:r>
     </w:p>
     <w:p>
@@ -4266,7 +4365,7 @@
         <w:pStyle w:val="Compact"/>
       </w:pPr>
       <w:r>
-        <w:t xml:space="preserve">Houston scenario:</w:t>
+        <w:t xml:space="preserve">KOR/ENG caption set:</w:t>
       </w:r>
       <w:r>
         <w:t xml:space="preserve"> </w:t>
@@ -4275,59 +4374,17 @@
         <w:rPr>
           <w:rStyle w:val="VerbatimChar"/>
         </w:rPr>
-        <w:t xml:space="preserve">../../results/2026-04-04-expanded-10seed/houston_report_figure.svg</w:t>
-      </w:r>
-    </w:p>
-    <w:p>
-      <w:pPr>
-        <w:numPr>
-          <w:ilvl w:val="0"/>
-          <w:numId w:val="1010"/>
-        </w:numPr>
-        <w:pStyle w:val="Compact"/>
-      </w:pPr>
-      <w:r>
-        <w:t xml:space="preserve">NOLA scenario:</w:t>
-      </w:r>
-      <w:r>
-        <w:t xml:space="preserve"> </w:t>
-      </w:r>
-      <w:r>
-        <w:rPr>
-          <w:rStyle w:val="VerbatimChar"/>
-        </w:rPr>
-        <w:t xml:space="preserve">../../results/2026-04-04-expanded-10seed/nola_report_figure.svg</w:t>
-      </w:r>
-    </w:p>
-    <w:p>
-      <w:pPr>
-        <w:numPr>
-          <w:ilvl w:val="0"/>
-          <w:numId w:val="1010"/>
-        </w:numPr>
-        <w:pStyle w:val="Compact"/>
-      </w:pPr>
-      <w:r>
-        <w:t xml:space="preserve">Seattle scenario:</w:t>
-      </w:r>
-      <w:r>
-        <w:t xml:space="preserve"> </w:t>
-      </w:r>
-      <w:r>
-        <w:rPr>
-          <w:rStyle w:val="VerbatimChar"/>
-        </w:rPr>
-        <w:t xml:space="preserve">../../results/2026-04-04-expanded-10seed/seattle_report_figure.svg</w:t>
+        <w:t xml:space="preserve">figure_captions_bilingual_v0.2_2026-04-09.md</w:t>
       </w:r>
     </w:p>
     <w:bookmarkEnd w:id="38"/>
-    <w:bookmarkStart w:id="39" w:name="submission-format-note"/>
+    <w:bookmarkStart w:id="39" w:name="scenario-visualization-evidence"/>
     <w:p>
       <w:pPr>
         <w:pStyle w:val="Heading2"/>
       </w:pPr>
       <w:r>
-        <w:t xml:space="preserve">10. Submission Format Note</w:t>
+        <w:t xml:space="preserve">9. Scenario Visualization Evidence</w:t>
       </w:r>
     </w:p>
     <w:p>
@@ -4339,7 +4396,7 @@
         <w:pStyle w:val="Compact"/>
       </w:pPr>
       <w:r>
-        <w:t xml:space="preserve">At this stage, authoring in</w:t>
+        <w:t xml:space="preserve">Houston scenario:</w:t>
       </w:r>
       <w:r>
         <w:t xml:space="preserve"> </w:t>
@@ -4348,13 +4405,7 @@
         <w:rPr>
           <w:rStyle w:val="VerbatimChar"/>
         </w:rPr>
-        <w:t xml:space="preserve">docs</w:t>
-      </w:r>
-      <w:r>
-        <w:t xml:space="preserve"> </w:t>
-      </w:r>
-      <w:r>
-        <w:t xml:space="preserve">is practical and reproducible.</w:t>
+        <w:t xml:space="preserve">../../results/2026-04-04-expanded-10seed/houston_report_figure.svg</w:t>
       </w:r>
     </w:p>
     <w:p>
@@ -4366,7 +4417,7 @@
         <w:pStyle w:val="Compact"/>
       </w:pPr>
       <w:r>
-        <w:t xml:space="preserve">For venue submission, convert to the target template (Word/LaTeX) while keeping</w:t>
+        <w:t xml:space="preserve">NOLA scenario:</w:t>
       </w:r>
       <w:r>
         <w:t xml:space="preserve"> </w:t>
@@ -4375,23 +4426,38 @@
         <w:rPr>
           <w:rStyle w:val="VerbatimChar"/>
         </w:rPr>
-        <w:t xml:space="preserve">docs/manuscript</w:t>
-      </w:r>
-      <w:r>
-        <w:t xml:space="preserve"> </w:t>
-      </w:r>
-      <w:r>
-        <w:t xml:space="preserve">as the single source of truth.</w:t>
+        <w:t xml:space="preserve">../../results/2026-04-04-expanded-10seed/nola_report_figure.svg</w:t>
+      </w:r>
+    </w:p>
+    <w:p>
+      <w:pPr>
+        <w:numPr>
+          <w:ilvl w:val="0"/>
+          <w:numId w:val="1011"/>
+        </w:numPr>
+        <w:pStyle w:val="Compact"/>
+      </w:pPr>
+      <w:r>
+        <w:t xml:space="preserve">Seattle scenario:</w:t>
+      </w:r>
+      <w:r>
+        <w:t xml:space="preserve"> </w:t>
+      </w:r>
+      <w:r>
+        <w:rPr>
+          <w:rStyle w:val="VerbatimChar"/>
+        </w:rPr>
+        <w:t xml:space="preserve">../../results/2026-04-04-expanded-10seed/seattle_report_figure.svg</w:t>
       </w:r>
     </w:p>
     <w:bookmarkEnd w:id="39"/>
-    <w:bookmarkStart w:id="40" w:name="submission-readiness-artifacts"/>
+    <w:bookmarkStart w:id="40" w:name="submission-format-note"/>
     <w:p>
       <w:pPr>
         <w:pStyle w:val="Heading2"/>
       </w:pPr>
       <w:r>
-        <w:t xml:space="preserve">11. Submission-Readiness Artifacts</w:t>
+        <w:t xml:space="preserve">10. Submission Format Note</w:t>
       </w:r>
     </w:p>
     <w:p>
@@ -4403,7 +4469,7 @@
         <w:pStyle w:val="Compact"/>
       </w:pPr>
       <w:r>
-        <w:t xml:space="preserve">LaTeX venue template draft:</w:t>
+        <w:t xml:space="preserve">At this stage, authoring in</w:t>
       </w:r>
       <w:r>
         <w:t xml:space="preserve"> </w:t>
@@ -4412,7 +4478,13 @@
         <w:rPr>
           <w:rStyle w:val="VerbatimChar"/>
         </w:rPr>
-        <w:t xml:space="preserve">manuscript_submission_template_v0.2_2026-04-09.tex</w:t>
+        <w:t xml:space="preserve">docs</w:t>
+      </w:r>
+      <w:r>
+        <w:t xml:space="preserve"> </w:t>
+      </w:r>
+      <w:r>
+        <w:t xml:space="preserve">is practical and reproducible.</w:t>
       </w:r>
     </w:p>
     <w:p>
@@ -4424,7 +4496,7 @@
         <w:pStyle w:val="Compact"/>
       </w:pPr>
       <w:r>
-        <w:t xml:space="preserve">Consistency audit report:</w:t>
+        <w:t xml:space="preserve">For venue submission, convert to the target template (Word/LaTeX) while keeping</w:t>
       </w:r>
       <w:r>
         <w:t xml:space="preserve"> </w:t>
@@ -4433,107 +4505,23 @@
         <w:rPr>
           <w:rStyle w:val="VerbatimChar"/>
         </w:rPr>
-        <w:t xml:space="preserve">manuscript_consistency_report_v0.2_2026-04-09.md</w:t>
-      </w:r>
-    </w:p>
-    <w:p>
-      <w:pPr>
-        <w:numPr>
-          <w:ilvl w:val="0"/>
-          <w:numId w:val="1012"/>
-        </w:numPr>
-        <w:pStyle w:val="Compact"/>
-      </w:pPr>
-      <w:r>
-        <w:t xml:space="preserve">Bilingual parity report:</w:t>
-      </w:r>
-      <w:r>
-        <w:t xml:space="preserve"> </w:t>
-      </w:r>
-      <w:r>
-        <w:rPr>
-          <w:rStyle w:val="VerbatimChar"/>
-        </w:rPr>
-        <w:t xml:space="preserve">bilingual_parity_report_v0.2_2026-04-09.md</w:t>
-      </w:r>
-    </w:p>
-    <w:p>
-      <w:pPr>
-        <w:numPr>
-          <w:ilvl w:val="0"/>
-          <w:numId w:val="1012"/>
-        </w:numPr>
-        <w:pStyle w:val="Compact"/>
-      </w:pPr>
-      <w:r>
-        <w:t xml:space="preserve">Transfer repeated-randomization appendix:</w:t>
-      </w:r>
-      <w:r>
-        <w:t xml:space="preserve"> </w:t>
-      </w:r>
-      <w:r>
-        <w:rPr>
-          <w:rStyle w:val="VerbatimChar"/>
-        </w:rPr>
-        <w:t xml:space="preserve">transfer_route_repeated_randomization_appendix_v0.2_2026-04-09.md</w:t>
-      </w:r>
-    </w:p>
-    <w:p>
-      <w:pPr>
-        <w:numPr>
-          <w:ilvl w:val="0"/>
-          <w:numId w:val="1012"/>
-        </w:numPr>
-        <w:pStyle w:val="Compact"/>
-      </w:pPr>
-      <w:r>
-        <w:t xml:space="preserve">Out-of-domain validation appendix:</w:t>
-      </w:r>
-      <w:r>
-        <w:t xml:space="preserve"> </w:t>
-      </w:r>
-      <w:r>
-        <w:rPr>
-          <w:rStyle w:val="VerbatimChar"/>
-        </w:rPr>
-        <w:t xml:space="preserve">out_of_domain_validation_appendix_v0.2_2026-04-09.md</w:t>
-      </w:r>
-    </w:p>
-    <w:p>
-      <w:pPr>
-        <w:numPr>
-          <w:ilvl w:val="0"/>
-          <w:numId w:val="1012"/>
-        </w:numPr>
-        <w:pStyle w:val="Compact"/>
-      </w:pPr>
-      <w:r>
-        <w:t xml:space="preserve">Automated consistency status:</w:t>
-      </w:r>
-      <w:r>
-        <w:t xml:space="preserve"> </w:t>
-      </w:r>
-      <w:r>
-        <w:rPr>
-          <w:rStyle w:val="VerbatimChar"/>
-        </w:rPr>
-        <w:t xml:space="preserve">PASS</w:t>
-      </w:r>
-      <w:r>
-        <w:t xml:space="preserve"> </w:t>
-      </w:r>
-      <w:r>
-        <w:t xml:space="preserve">(6/6)</w:t>
+        <w:t xml:space="preserve">docs/manuscript</w:t>
+      </w:r>
+      <w:r>
+        <w:t xml:space="preserve"> </w:t>
+      </w:r>
+      <w:r>
+        <w:t xml:space="preserve">as the single source of truth.</w:t>
       </w:r>
     </w:p>
     <w:bookmarkEnd w:id="40"/>
-    <w:bookmarkStart w:id="41" w:name="prior-work-evidence-matrix"/>
+    <w:bookmarkStart w:id="41" w:name="submission-readiness-artifacts"/>
     <w:p>
       <w:pPr>
         <w:pStyle w:val="Heading2"/>
       </w:pPr>
       <w:r>
-        <w:t xml:space="preserve">12. Prior-Work Evidence Matrix</w:t>
+        <w:t xml:space="preserve">11. Submission-Readiness Artifacts</w:t>
       </w:r>
     </w:p>
     <w:p>
@@ -4545,7 +4533,7 @@
         <w:pStyle w:val="Compact"/>
       </w:pPr>
       <w:r>
-        <w:t xml:space="preserve">Evidence matrix:</w:t>
+        <w:t xml:space="preserve">LaTeX venue template draft:</w:t>
       </w:r>
       <w:r>
         <w:t xml:space="preserve"> </w:t>
@@ -4554,7 +4542,7 @@
         <w:rPr>
           <w:rStyle w:val="VerbatimChar"/>
         </w:rPr>
-        <w:t xml:space="preserve">prior_work_evidence_matrix_v0.2_2026-04-09.md</w:t>
+        <w:t xml:space="preserve">manuscript_submission_template_v0.2_2026-04-09.tex</w:t>
       </w:r>
     </w:p>
     <w:p>
@@ -4566,17 +4554,116 @@
         <w:pStyle w:val="Compact"/>
       </w:pPr>
       <w:r>
-        <w:t xml:space="preserve">It maps each core claim to supporting literature and explicitly documents residual gaps.</w:t>
+        <w:t xml:space="preserve">Consistency audit report:</w:t>
+      </w:r>
+      <w:r>
+        <w:t xml:space="preserve"> </w:t>
+      </w:r>
+      <w:r>
+        <w:rPr>
+          <w:rStyle w:val="VerbatimChar"/>
+        </w:rPr>
+        <w:t xml:space="preserve">manuscript_consistency_report_v0.2_2026-04-09.md</w:t>
+      </w:r>
+    </w:p>
+    <w:p>
+      <w:pPr>
+        <w:numPr>
+          <w:ilvl w:val="0"/>
+          <w:numId w:val="1013"/>
+        </w:numPr>
+        <w:pStyle w:val="Compact"/>
+      </w:pPr>
+      <w:r>
+        <w:t xml:space="preserve">Bilingual parity report:</w:t>
+      </w:r>
+      <w:r>
+        <w:t xml:space="preserve"> </w:t>
+      </w:r>
+      <w:r>
+        <w:rPr>
+          <w:rStyle w:val="VerbatimChar"/>
+        </w:rPr>
+        <w:t xml:space="preserve">bilingual_parity_report_v0.2_2026-04-09.md</w:t>
+      </w:r>
+    </w:p>
+    <w:p>
+      <w:pPr>
+        <w:numPr>
+          <w:ilvl w:val="0"/>
+          <w:numId w:val="1013"/>
+        </w:numPr>
+        <w:pStyle w:val="Compact"/>
+      </w:pPr>
+      <w:r>
+        <w:t xml:space="preserve">Transfer repeated-randomization appendix:</w:t>
+      </w:r>
+      <w:r>
+        <w:t xml:space="preserve"> </w:t>
+      </w:r>
+      <w:r>
+        <w:rPr>
+          <w:rStyle w:val="VerbatimChar"/>
+        </w:rPr>
+        <w:t xml:space="preserve">transfer_route_repeated_randomization_appendix_v0.2_2026-04-09.md</w:t>
+      </w:r>
+    </w:p>
+    <w:p>
+      <w:pPr>
+        <w:numPr>
+          <w:ilvl w:val="0"/>
+          <w:numId w:val="1013"/>
+        </w:numPr>
+        <w:pStyle w:val="Compact"/>
+      </w:pPr>
+      <w:r>
+        <w:t xml:space="preserve">Out-of-domain validation appendix:</w:t>
+      </w:r>
+      <w:r>
+        <w:t xml:space="preserve"> </w:t>
+      </w:r>
+      <w:r>
+        <w:rPr>
+          <w:rStyle w:val="VerbatimChar"/>
+        </w:rPr>
+        <w:t xml:space="preserve">out_of_domain_validation_appendix_v0.2_2026-04-09.md</w:t>
+      </w:r>
+    </w:p>
+    <w:p>
+      <w:pPr>
+        <w:numPr>
+          <w:ilvl w:val="0"/>
+          <w:numId w:val="1013"/>
+        </w:numPr>
+        <w:pStyle w:val="Compact"/>
+      </w:pPr>
+      <w:r>
+        <w:t xml:space="preserve">Automated consistency status:</w:t>
+      </w:r>
+      <w:r>
+        <w:t xml:space="preserve"> </w:t>
+      </w:r>
+      <w:r>
+        <w:rPr>
+          <w:rStyle w:val="VerbatimChar"/>
+        </w:rPr>
+        <w:t xml:space="preserve">PASS</w:t>
+      </w:r>
+      <w:r>
+        <w:t xml:space="preserve"> </w:t>
+      </w:r>
+      <w:r>
+        <w:t xml:space="preserve">(6/6)</w:t>
       </w:r>
     </w:p>
     <w:bookmarkEnd w:id="41"/>
-    <w:bookmarkStart w:id="42" w:name="examiner-priority-todo"/>
+    <w:bookmarkStart w:id="43" w:name="prior-work-evidence-matrix"/>
     <w:p>
       <w:pPr>
         <w:pStyle w:val="Heading2"/>
       </w:pPr>
       <w:r>
-        <w:t xml:space="preserve">13. Examiner-Priority TODO</w:t>
+        <w:t xml:space="preserve">12. Prior-Work Evidence Matrix</w:t>
       </w:r>
     </w:p>
     <w:p>
@@ -4588,7 +4675,7 @@
         <w:pStyle w:val="Compact"/>
       </w:pPr>
       <w:r>
-        <w:t xml:space="preserve">Detailed TODO:</w:t>
+        <w:t xml:space="preserve">Evidence matrix:</w:t>
       </w:r>
       <w:r>
         <w:t xml:space="preserve"> </w:t>
@@ -4597,7 +4684,7 @@
         <w:rPr>
           <w:rStyle w:val="VerbatimChar"/>
         </w:rPr>
-        <w:t xml:space="preserve">examiner_critical_todo_v0.2_2026-04-09.md</w:t>
+        <w:t xml:space="preserve">prior_work_evidence_matrix_v0.2_2026-04-09.md</w:t>
       </w:r>
     </w:p>
     <w:p>
@@ -4609,17 +4696,16 @@
         <w:pStyle w:val="Compact"/>
       </w:pPr>
       <w:r>
-        <w:t xml:space="preserve">This TODO prioritizes novelty framing, statistical testing, external validation scope, and operational threshold interpretation.</w:t>
-      </w:r>
-    </w:p>
-    <w:bookmarkEnd w:id="42"/>
-    <w:bookmarkStart w:id="43" w:name="statistical-significance-appendix"/>
-    <w:p>
-      <w:pPr>
-        <w:pStyle w:val="Heading2"/>
-      </w:pPr>
-      <w:r>
-        <w:t xml:space="preserve">14. Statistical Significance Appendix</w:t>
+        <w:t xml:space="preserve">It maps each core claim to supporting literature and explicitly documents residual gaps.</w:t>
+      </w:r>
+    </w:p>
+    <w:bookmarkStart w:id="42" w:name="related-work-differential-core-8-studies"/>
+    <w:p>
+      <w:pPr>
+        <w:pStyle w:val="Heading3"/>
+      </w:pPr>
+      <w:r>
+        <w:t xml:space="preserve">12.1 Related Work Differential (Core 8 Studies)</w:t>
       </w:r>
     </w:p>
     <w:p>
@@ -4631,6 +4717,147 @@
         <w:pStyle w:val="Compact"/>
       </w:pPr>
       <w:r>
+        <w:t xml:space="preserve">The table below summarizes one-line novelty deltas against key prior references using</w:t>
+      </w:r>
+      <w:r>
+        <w:t xml:space="preserve"> </w:t>
+      </w:r>
+      <w:r>
+        <w:rPr>
+          <w:rStyle w:val="VerbatimChar"/>
+        </w:rPr>
+        <w:t xml:space="preserve">RW</w:t>
+      </w:r>
+      <w:r>
+        <w:t xml:space="preserve"> </w:t>
+      </w:r>
+      <w:r>
+        <w:t xml:space="preserve">IDs.</w:t>
+      </w:r>
+      <w:r>
+        <w:t xml:space="preserve"> </w:t>
+      </w:r>
+      <w:r>
+        <w:t xml:space="preserve">| rw_id | prior_focus | prior_gap | this_study_delta |</w:t>
+      </w:r>
+      <w:r>
+        <w:t xml:space="preserve"> </w:t>
+      </w:r>
+      <w:r>
+        <w:t xml:space="preserve">| — | — | — | — |</w:t>
+      </w:r>
+      <w:r>
+        <w:t xml:space="preserve"> </w:t>
+      </w:r>
+      <w:r>
+        <w:t xml:space="preserve">| RW-03 | AIS near-miss detection proxy from realized trajectory proximity. | Limited linkage to calibration-governed operational thresholding. | Combines near-miss proxy labeling with ECE-gated model/threshold governance. |</w:t>
+      </w:r>
+      <w:r>
+        <w:t xml:space="preserve"> </w:t>
+      </w:r>
+      <w:r>
+        <w:t xml:space="preserve">| RW-04 | Real-time multi-vessel collision-risk surveillance architecture. | Less emphasis on cross-region transfer uncertainty and significance control. | Adds cross-region transfer CI + repeated-randomization significance appendices. |</w:t>
+      </w:r>
+      <w:r>
+        <w:t xml:space="preserve"> </w:t>
+      </w:r>
+      <w:r>
+        <w:t xml:space="preserve">| RW-05 | Velocity-obstacle geometry baseline for risk candidate detection. | Geometry-first approach lacks ML calibration comparison protocol. | Presents tabular/raster ML ablation with calibration constraints and utility analysis. |</w:t>
+      </w:r>
+      <w:r>
+        <w:t xml:space="preserve"> </w:t>
+      </w:r>
+      <w:r>
+        <w:t xml:space="preserve">| RW-07 | AIS feature pipeline with ML-based risk prediction feasibility. | Weak emphasis on reviewer-ready uncertainty artifact packaging. | Provides manuscript-grade uncertainty/significance/consistency artifact bundle. |</w:t>
+      </w:r>
+      <w:r>
+        <w:t xml:space="preserve"> </w:t>
+      </w:r>
+      <w:r>
+        <w:t xml:space="preserve">| RW-08 | Regional quantitative AIS risk diagnostics. | Transfer-route directionality and route-specific statistical robustness underreported. | Reports route-level delta direction probability and Holm-adjusted repeated tests. |</w:t>
+      </w:r>
+      <w:r>
+        <w:t xml:space="preserve"> </w:t>
+      </w:r>
+      <w:r>
+        <w:t xml:space="preserve">| RW-09 | Method taxonomy and limitation overview for maritime collision risk. | Taxonomy not tied to concrete acceptance-gated manuscript workflow. | Converts taxonomy into examiner-acceptance TODO closure matrix. |</w:t>
+      </w:r>
+      <w:r>
+        <w:t xml:space="preserve"> </w:t>
+      </w:r>
+      <w:r>
+        <w:t xml:space="preserve">| RW-11 | Calibration necessity for modern predictive models. | No maritime-specific ECE governance instantiation. | Operationalizes ECE&lt;=0.1 gate for model and threshold decision flow. |</w:t>
+      </w:r>
+      <w:r>
+        <w:t xml:space="preserve"> </w:t>
+      </w:r>
+      <w:r>
+        <w:t xml:space="preserve">| RW-12 | Theoretical source-target divergence bound for transfer learning. | Theory-to-route evidence bridge is often qualitative only. | Connects divergence caution to route-level empirical transfer significance outcomes. |</w:t>
+      </w:r>
+    </w:p>
+    <w:bookmarkEnd w:id="42"/>
+    <w:bookmarkEnd w:id="43"/>
+    <w:bookmarkStart w:id="44" w:name="examiner-priority-todo"/>
+    <w:p>
+      <w:pPr>
+        <w:pStyle w:val="Heading2"/>
+      </w:pPr>
+      <w:r>
+        <w:t xml:space="preserve">13. Examiner-Priority TODO</w:t>
+      </w:r>
+    </w:p>
+    <w:p>
+      <w:pPr>
+        <w:numPr>
+          <w:ilvl w:val="0"/>
+          <w:numId w:val="1016"/>
+        </w:numPr>
+        <w:pStyle w:val="Compact"/>
+      </w:pPr>
+      <w:r>
+        <w:t xml:space="preserve">Detailed TODO:</w:t>
+      </w:r>
+      <w:r>
+        <w:t xml:space="preserve"> </w:t>
+      </w:r>
+      <w:r>
+        <w:rPr>
+          <w:rStyle w:val="VerbatimChar"/>
+        </w:rPr>
+        <w:t xml:space="preserve">examiner_critical_todo_v0.2_2026-04-09.md</w:t>
+      </w:r>
+    </w:p>
+    <w:p>
+      <w:pPr>
+        <w:numPr>
+          <w:ilvl w:val="0"/>
+          <w:numId w:val="1016"/>
+        </w:numPr>
+        <w:pStyle w:val="Compact"/>
+      </w:pPr>
+      <w:r>
+        <w:t xml:space="preserve">This TODO prioritizes novelty framing, statistical testing, external validation scope, and operational threshold interpretation.</w:t>
+      </w:r>
+    </w:p>
+    <w:bookmarkEnd w:id="44"/>
+    <w:bookmarkStart w:id="45" w:name="statistical-significance-appendix"/>
+    <w:p>
+      <w:pPr>
+        <w:pStyle w:val="Heading2"/>
+      </w:pPr>
+      <w:r>
+        <w:t xml:space="preserve">14. Statistical Significance Appendix</w:t>
+      </w:r>
+    </w:p>
+    <w:p>
+      <w:pPr>
+        <w:numPr>
+          <w:ilvl w:val="0"/>
+          <w:numId w:val="1017"/>
+        </w:numPr>
+        <w:pStyle w:val="Compact"/>
+      </w:pPr>
+      <w:r>
         <w:t xml:space="preserve">Significance summary CSV:</w:t>
       </w:r>
       <w:r>
@@ -4647,7 +4874,7 @@
       <w:pPr>
         <w:numPr>
           <w:ilvl w:val="0"/>
-          <w:numId w:val="1015"/>
+          <w:numId w:val="1017"/>
         </w:numPr>
         <w:pStyle w:val="Compact"/>
       </w:pPr>
@@ -4668,7 +4895,7 @@
       <w:pPr>
         <w:numPr>
           <w:ilvl w:val="0"/>
-          <w:numId w:val="1015"/>
+          <w:numId w:val="1017"/>
         </w:numPr>
         <w:pStyle w:val="Compact"/>
       </w:pPr>
@@ -5124,8 +5351,8 @@
         <w:t xml:space="preserve">- seattle: ΔF1=+0.0136 (Holm p=0.0117), ΔECE=-0.2572 (Holm p=0.0060)</w:t>
       </w:r>
     </w:p>
-    <w:bookmarkEnd w:id="43"/>
-    <w:bookmarkStart w:id="44" w:name="X0d7739412717a22a0ae688af860fff346e5f7e0"/>
+    <w:bookmarkEnd w:id="45"/>
+    <w:bookmarkStart w:id="46" w:name="X0d7739412717a22a0ae688af860fff346e5f7e0"/>
     <w:p>
       <w:pPr>
         <w:pStyle w:val="Heading2"/>
@@ -5138,7 +5365,7 @@
       <w:pPr>
         <w:numPr>
           <w:ilvl w:val="0"/>
-          <w:numId w:val="1016"/>
+          <w:numId w:val="1018"/>
         </w:numPr>
         <w:pStyle w:val="Compact"/>
       </w:pPr>
@@ -5159,7 +5386,7 @@
       <w:pPr>
         <w:numPr>
           <w:ilvl w:val="0"/>
-          <w:numId w:val="1016"/>
+          <w:numId w:val="1018"/>
         </w:numPr>
         <w:pStyle w:val="Compact"/>
       </w:pPr>
@@ -5867,8 +6094,8 @@
         <w:t xml:space="preserve">- seattle-&gt;nola: ΔF1=+0.0488, bootstrap p=0.2960, direction_prob=0.8520</w:t>
       </w:r>
     </w:p>
-    <w:bookmarkEnd w:id="44"/>
-    <w:bookmarkStart w:id="45" w:name="Xca035c03012a94c8557586c34d9817ef00c193c"/>
+    <w:bookmarkEnd w:id="46"/>
+    <w:bookmarkStart w:id="47" w:name="Xca035c03012a94c8557586c34d9817ef00c193c"/>
     <w:p>
       <w:pPr>
         <w:pStyle w:val="Heading2"/>
@@ -5881,7 +6108,7 @@
       <w:pPr>
         <w:numPr>
           <w:ilvl w:val="0"/>
-          <w:numId w:val="1017"/>
+          <w:numId w:val="1019"/>
         </w:numPr>
         <w:pStyle w:val="Compact"/>
       </w:pPr>
@@ -5902,7 +6129,7 @@
       <w:pPr>
         <w:numPr>
           <w:ilvl w:val="0"/>
-          <w:numId w:val="1017"/>
+          <w:numId w:val="1019"/>
         </w:numPr>
         <w:pStyle w:val="Compact"/>
       </w:pPr>
@@ -6922,8 +7149,8 @@
         <w:t xml:space="preserve">- seattle-&gt;nola: median p=0.3100, Holm p=0.6200, direction_consistency=1.0000, sig_runs=0/25</w:t>
       </w:r>
     </w:p>
-    <w:bookmarkEnd w:id="45"/>
-    <w:bookmarkStart w:id="46" w:name="X87628fc250d7b1867276627138d9078c8975729"/>
+    <w:bookmarkEnd w:id="47"/>
+    <w:bookmarkStart w:id="48" w:name="X87628fc250d7b1867276627138d9078c8975729"/>
     <w:p>
       <w:pPr>
         <w:pStyle w:val="Heading2"/>
@@ -6936,7 +7163,7 @@
       <w:pPr>
         <w:numPr>
           <w:ilvl w:val="0"/>
-          <w:numId w:val="1018"/>
+          <w:numId w:val="1020"/>
         </w:numPr>
         <w:pStyle w:val="Compact"/>
       </w:pPr>
@@ -6957,7 +7184,7 @@
       <w:pPr>
         <w:numPr>
           <w:ilvl w:val="0"/>
-          <w:numId w:val="1018"/>
+          <w:numId w:val="1020"/>
         </w:numPr>
         <w:pStyle w:val="Compact"/>
       </w:pPr>
@@ -6978,7 +7205,7 @@
       <w:pPr>
         <w:numPr>
           <w:ilvl w:val="0"/>
-          <w:numId w:val="1018"/>
+          <w:numId w:val="1020"/>
         </w:numPr>
         <w:pStyle w:val="Compact"/>
       </w:pPr>
@@ -7578,8 +7805,8 @@
         <w:t xml:space="preserve">- seattle: governed=0.60 -&gt; utility-opt=0.36, cost_reduction=+47.50%, F1_delta=+0.0160</w:t>
       </w:r>
     </w:p>
-    <w:bookmarkEnd w:id="46"/>
-    <w:bookmarkEnd w:id="47"/>
+    <w:bookmarkEnd w:id="48"/>
+    <w:bookmarkEnd w:id="49"/>
     <w:sectPr/>
   </w:body>
 </w:document>
@@ -7817,6 +8044,12 @@
     <w:abstractNumId w:val="991"/>
   </w:num>
   <w:num w:numId="1018">
+    <w:abstractNumId w:val="991"/>
+  </w:num>
+  <w:num w:numId="1019">
+    <w:abstractNumId w:val="991"/>
+  </w:num>
+  <w:num w:numId="1020">
     <w:abstractNumId w:val="991"/>
   </w:num>
 </w:numbering>

</xml_diff>

<commit_message>
Add objective manuscript completion scorecard
</commit_message>
<xml_diff>
--- a/docs/manuscript/v0.2_2026-04-09/manuscript_draft_v0.2_2026-04-09_en.docx
+++ b/docs/manuscript/v0.2_2026-04-09/manuscript_draft_v0.2_2026-04-09_en.docx
@@ -4564,6 +4564,27 @@
           <w:rStyle w:val="VerbatimChar"/>
         </w:rPr>
         <w:t xml:space="preserve">manuscript_consistency_report_v0.2_2026-04-09.md</w:t>
+      </w:r>
+    </w:p>
+    <w:p>
+      <w:pPr>
+        <w:numPr>
+          <w:ilvl w:val="0"/>
+          <w:numId w:val="1013"/>
+        </w:numPr>
+        <w:pStyle w:val="Compact"/>
+      </w:pPr>
+      <w:r>
+        <w:t xml:space="preserve">Completion scorecard:</w:t>
+      </w:r>
+      <w:r>
+        <w:t xml:space="preserve"> </w:t>
+      </w:r>
+      <w:r>
+        <w:rPr>
+          <w:rStyle w:val="VerbatimChar"/>
+        </w:rPr>
+        <w:t xml:space="preserve">manuscript_completion_scorecard_v0.2_2026-04-09.md</w:t>
       </w:r>
     </w:p>
     <w:p>

</xml_diff>